<commit_message>
test aruco detection flow on computer
</commit_message>
<xml_diff>
--- a/docs/matlab image processing.docx
+++ b/docs/matlab image processing.docx
@@ -336,6 +336,7 @@
       </w:pPr>
       <w:r>
         <w:rPr>
+          <w:noProof/>
           <w:lang w:val="en-GB"/>
         </w:rPr>
         <w:drawing>
@@ -373,6 +374,4136 @@
             </a:graphic>
           </wp:inline>
         </w:drawing>
+      </w:r>
+    </w:p>
+    <w:p>
+      <w:pPr>
+        <w:spacing w:after="0"/>
+        <w:rPr>
+          <w:lang w:val="en-GB"/>
+        </w:rPr>
+      </w:pPr>
+    </w:p>
+    <w:p>
+      <w:pPr>
+        <w:spacing w:after="0"/>
+        <w:rPr>
+          <w:lang w:val="en-GB"/>
+        </w:rPr>
+      </w:pPr>
+    </w:p>
+    <w:p>
+      <w:pPr>
+        <w:spacing w:after="0"/>
+        <w:rPr>
+          <w:lang w:val="en-GB"/>
+        </w:rPr>
+      </w:pPr>
+    </w:p>
+    <w:p>
+      <w:pPr>
+        <w:spacing w:after="0"/>
+        <w:rPr>
+          <w:lang w:val="en-GB"/>
+        </w:rPr>
+      </w:pPr>
+      <w:r>
+        <w:lastRenderedPageBreak/>
+        <w:drawing>
+          <wp:anchor distT="0" distB="0" distL="114300" distR="114300" simplePos="0" relativeHeight="251682816" behindDoc="0" locked="0" layoutInCell="1" allowOverlap="1" wp14:anchorId="0A9366CB" wp14:editId="4E7659C4">
+            <wp:simplePos x="0" y="0"/>
+            <wp:positionH relativeFrom="column">
+              <wp:posOffset>2933700</wp:posOffset>
+            </wp:positionH>
+            <wp:positionV relativeFrom="paragraph">
+              <wp:posOffset>179109</wp:posOffset>
+            </wp:positionV>
+            <wp:extent cx="2803835" cy="1869311"/>
+            <wp:effectExtent l="0" t="0" r="0" b="0"/>
+            <wp:wrapNone/>
+            <wp:docPr id="2" name="Image 1" descr="Une image contenant texte, capture d’écran, carte&#10;&#10;Le contenu généré par l’IA peut être incorrect.">
+              <a:extLst xmlns:a="http://schemas.openxmlformats.org/drawingml/2006/main">
+                <a:ext uri="{FF2B5EF4-FFF2-40B4-BE49-F238E27FC236}">
+                  <a16:creationId xmlns:a16="http://schemas.microsoft.com/office/drawing/2014/main" id="{7420367F-99EA-203C-6F19-B7143B797BDA}"/>
+                </a:ext>
+              </a:extLst>
+            </wp:docPr>
+            <wp:cNvGraphicFramePr>
+              <a:graphicFrameLocks xmlns:a="http://schemas.openxmlformats.org/drawingml/2006/main" noChangeAspect="1"/>
+            </wp:cNvGraphicFramePr>
+            <a:graphic xmlns:a="http://schemas.openxmlformats.org/drawingml/2006/main">
+              <a:graphicData uri="http://schemas.openxmlformats.org/drawingml/2006/picture">
+                <pic:pic xmlns:pic="http://schemas.openxmlformats.org/drawingml/2006/picture">
+                  <pic:nvPicPr>
+                    <pic:cNvPr id="2" name="Image 1" descr="Une image contenant texte, capture d’écran, carte&#10;&#10;Le contenu généré par l’IA peut être incorrect.">
+                      <a:extLst>
+                        <a:ext uri="{FF2B5EF4-FFF2-40B4-BE49-F238E27FC236}">
+                          <a16:creationId xmlns:a16="http://schemas.microsoft.com/office/drawing/2014/main" id="{7420367F-99EA-203C-6F19-B7143B797BDA}"/>
+                        </a:ext>
+                      </a:extLst>
+                    </pic:cNvPr>
+                    <pic:cNvPicPr>
+                      <a:picLocks noChangeAspect="1"/>
+                    </pic:cNvPicPr>
+                  </pic:nvPicPr>
+                  <pic:blipFill>
+                    <a:blip r:embed="rId7" cstate="print">
+                      <a:extLst>
+                        <a:ext uri="{28A0092B-C50C-407E-A947-70E740481C1C}">
+                          <a14:useLocalDpi xmlns:a14="http://schemas.microsoft.com/office/drawing/2010/main" val="0"/>
+                        </a:ext>
+                      </a:extLst>
+                    </a:blip>
+                    <a:stretch>
+                      <a:fillRect/>
+                    </a:stretch>
+                  </pic:blipFill>
+                  <pic:spPr>
+                    <a:xfrm>
+                      <a:off x="0" y="0"/>
+                      <a:ext cx="2803835" cy="1869311"/>
+                    </a:xfrm>
+                    <a:prstGeom prst="rect">
+                      <a:avLst/>
+                    </a:prstGeom>
+                  </pic:spPr>
+                </pic:pic>
+              </a:graphicData>
+            </a:graphic>
+          </wp:anchor>
+        </w:drawing>
+      </w:r>
+    </w:p>
+    <w:p>
+      <w:pPr>
+        <w:spacing w:after="0"/>
+        <w:rPr>
+          <w:lang w:val="en-GB"/>
+        </w:rPr>
+      </w:pPr>
+    </w:p>
+    <w:p>
+      <w:pPr>
+        <w:spacing w:after="0"/>
+        <w:rPr>
+          <w:lang w:val="en-GB"/>
+        </w:rPr>
+      </w:pPr>
+      <w:r>
+        <mc:AlternateContent>
+          <mc:Choice Requires="wps">
+            <w:drawing>
+              <wp:anchor distT="0" distB="0" distL="114300" distR="114300" simplePos="0" relativeHeight="251685888" behindDoc="0" locked="0" layoutInCell="1" allowOverlap="1" wp14:anchorId="43C968DD" wp14:editId="0272CFDD">
+                <wp:simplePos x="0" y="0"/>
+                <wp:positionH relativeFrom="column">
+                  <wp:posOffset>346075</wp:posOffset>
+                </wp:positionH>
+                <wp:positionV relativeFrom="paragraph">
+                  <wp:posOffset>1867535</wp:posOffset>
+                </wp:positionV>
+                <wp:extent cx="2268855" cy="257810"/>
+                <wp:effectExtent l="0" t="0" r="17145" b="27940"/>
+                <wp:wrapNone/>
+                <wp:docPr id="7" name="Rectangle : coins arrondis 6">
+                  <a:extLst xmlns:a="http://schemas.openxmlformats.org/drawingml/2006/main">
+                    <a:ext uri="{FF2B5EF4-FFF2-40B4-BE49-F238E27FC236}">
+                      <a16:creationId xmlns:a16="http://schemas.microsoft.com/office/drawing/2014/main" id="{2D1CA408-71BC-BB92-1435-9CB1E71A4D90}"/>
+                    </a:ext>
+                  </a:extLst>
+                </wp:docPr>
+                <wp:cNvGraphicFramePr/>
+                <a:graphic xmlns:a="http://schemas.openxmlformats.org/drawingml/2006/main">
+                  <a:graphicData uri="http://schemas.microsoft.com/office/word/2010/wordprocessingShape">
+                    <wps:wsp>
+                      <wps:cNvSpPr/>
+                      <wps:spPr>
+                        <a:xfrm>
+                          <a:off x="0" y="0"/>
+                          <a:ext cx="2268855" cy="257810"/>
+                        </a:xfrm>
+                        <a:prstGeom prst="roundRect">
+                          <a:avLst/>
+                        </a:prstGeom>
+                        <a:noFill/>
+                        <a:ln>
+                          <a:solidFill>
+                            <a:schemeClr val="tx1"/>
+                          </a:solidFill>
+                        </a:ln>
+                      </wps:spPr>
+                      <wps:style>
+                        <a:lnRef idx="2">
+                          <a:schemeClr val="accent1">
+                            <a:shade val="15000"/>
+                          </a:schemeClr>
+                        </a:lnRef>
+                        <a:fillRef idx="1">
+                          <a:schemeClr val="accent1"/>
+                        </a:fillRef>
+                        <a:effectRef idx="0">
+                          <a:schemeClr val="accent1"/>
+                        </a:effectRef>
+                        <a:fontRef idx="minor">
+                          <a:schemeClr val="lt1"/>
+                        </a:fontRef>
+                      </wps:style>
+                      <wps:txbx>
+                        <w:txbxContent>
+                          <w:p>
+                            <w:pPr>
+                              <w:jc w:val="center"/>
+                              <w:rPr>
+                                <w:rFonts w:hAnsi="Calibri"/>
+                                <w:color w:val="000000" w:themeColor="text1"/>
+                                <w:kern w:val="24"/>
+                                <w:sz w:val="20"/>
+                                <w:szCs w:val="20"/>
+                                <w14:ligatures w14:val="none"/>
+                              </w:rPr>
+                            </w:pPr>
+                            <w:r>
+                              <w:rPr>
+                                <w:rFonts w:hAnsi="Calibri"/>
+                                <w:color w:val="000000" w:themeColor="text1"/>
+                                <w:kern w:val="24"/>
+                                <w:sz w:val="20"/>
+                                <w:szCs w:val="20"/>
+                              </w:rPr>
+                              <w:t>Repère caméra</w:t>
+                            </w:r>
+                          </w:p>
+                        </w:txbxContent>
+                      </wps:txbx>
+                      <wps:bodyPr rtlCol="0" anchor="ctr"/>
+                    </wps:wsp>
+                  </a:graphicData>
+                </a:graphic>
+              </wp:anchor>
+            </w:drawing>
+          </mc:Choice>
+          <mc:Fallback>
+            <w:pict>
+              <v:roundrect w14:anchorId="43C968DD" id="Rectangle : coins arrondis 6" o:spid="_x0000_s1026" style="position:absolute;margin-left:27.25pt;margin-top:147.05pt;width:178.65pt;height:20.3pt;z-index:251685888;visibility:visible;mso-wrap-style:square;mso-wrap-distance-left:9pt;mso-wrap-distance-top:0;mso-wrap-distance-right:9pt;mso-wrap-distance-bottom:0;mso-position-horizontal:absolute;mso-position-horizontal-relative:text;mso-position-vertical:absolute;mso-position-vertical-relative:text;v-text-anchor:middle" arcsize="10923f" o:gfxdata="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" filled="f" strokecolor="black [3213]" strokeweight="1pt">
+                <v:stroke joinstyle="miter"/>
+                <v:textbox>
+                  <w:txbxContent>
+                    <w:p>
+                      <w:pPr>
+                        <w:jc w:val="center"/>
+                        <w:rPr>
+                          <w:rFonts w:hAnsi="Calibri"/>
+                          <w:color w:val="000000" w:themeColor="text1"/>
+                          <w:kern w:val="24"/>
+                          <w:sz w:val="20"/>
+                          <w:szCs w:val="20"/>
+                          <w14:ligatures w14:val="none"/>
+                        </w:rPr>
+                      </w:pPr>
+                      <w:r>
+                        <w:rPr>
+                          <w:rFonts w:hAnsi="Calibri"/>
+                          <w:color w:val="000000" w:themeColor="text1"/>
+                          <w:kern w:val="24"/>
+                          <w:sz w:val="20"/>
+                          <w:szCs w:val="20"/>
+                        </w:rPr>
+                        <w:t>Repère caméra</w:t>
+                      </w:r>
+                    </w:p>
+                  </w:txbxContent>
+                </v:textbox>
+              </v:roundrect>
+            </w:pict>
+          </mc:Fallback>
+        </mc:AlternateContent>
+      </w:r>
+      <w:r>
+        <w:drawing>
+          <wp:anchor distT="0" distB="0" distL="114300" distR="114300" simplePos="0" relativeHeight="251684864" behindDoc="0" locked="0" layoutInCell="1" allowOverlap="1" wp14:anchorId="79D8B2B0" wp14:editId="38E89A5B">
+            <wp:simplePos x="0" y="0"/>
+            <wp:positionH relativeFrom="column">
+              <wp:posOffset>114300</wp:posOffset>
+            </wp:positionH>
+            <wp:positionV relativeFrom="paragraph">
+              <wp:posOffset>6350</wp:posOffset>
+            </wp:positionV>
+            <wp:extent cx="2625725" cy="1477010"/>
+            <wp:effectExtent l="0" t="0" r="3175" b="8890"/>
+            <wp:wrapNone/>
+            <wp:docPr id="4" name="Image 3" descr="Une image contenant carte, texte, puzzle, intérieur&#10;&#10;Le contenu généré par l’IA peut être incorrect.">
+              <a:extLst xmlns:a="http://schemas.openxmlformats.org/drawingml/2006/main">
+                <a:ext uri="{FF2B5EF4-FFF2-40B4-BE49-F238E27FC236}">
+                  <a16:creationId xmlns:a16="http://schemas.microsoft.com/office/drawing/2014/main" id="{159FF6FF-80EF-D19E-94B9-A7625402AC60}"/>
+                </a:ext>
+              </a:extLst>
+            </wp:docPr>
+            <wp:cNvGraphicFramePr>
+              <a:graphicFrameLocks xmlns:a="http://schemas.openxmlformats.org/drawingml/2006/main" noChangeAspect="1"/>
+            </wp:cNvGraphicFramePr>
+            <a:graphic xmlns:a="http://schemas.openxmlformats.org/drawingml/2006/main">
+              <a:graphicData uri="http://schemas.openxmlformats.org/drawingml/2006/picture">
+                <pic:pic xmlns:pic="http://schemas.openxmlformats.org/drawingml/2006/picture">
+                  <pic:nvPicPr>
+                    <pic:cNvPr id="4" name="Image 3" descr="Une image contenant carte, texte, puzzle, intérieur&#10;&#10;Le contenu généré par l’IA peut être incorrect.">
+                      <a:extLst>
+                        <a:ext uri="{FF2B5EF4-FFF2-40B4-BE49-F238E27FC236}">
+                          <a16:creationId xmlns:a16="http://schemas.microsoft.com/office/drawing/2014/main" id="{159FF6FF-80EF-D19E-94B9-A7625402AC60}"/>
+                        </a:ext>
+                      </a:extLst>
+                    </pic:cNvPr>
+                    <pic:cNvPicPr>
+                      <a:picLocks noChangeAspect="1"/>
+                    </pic:cNvPicPr>
+                  </pic:nvPicPr>
+                  <pic:blipFill>
+                    <a:blip r:embed="rId8" cstate="print">
+                      <a:extLst>
+                        <a:ext uri="{28A0092B-C50C-407E-A947-70E740481C1C}">
+                          <a14:useLocalDpi xmlns:a14="http://schemas.microsoft.com/office/drawing/2010/main" val="0"/>
+                        </a:ext>
+                      </a:extLst>
+                    </a:blip>
+                    <a:stretch>
+                      <a:fillRect/>
+                    </a:stretch>
+                  </pic:blipFill>
+                  <pic:spPr>
+                    <a:xfrm>
+                      <a:off x="0" y="0"/>
+                      <a:ext cx="2625725" cy="1477010"/>
+                    </a:xfrm>
+                    <a:prstGeom prst="rect">
+                      <a:avLst/>
+                    </a:prstGeom>
+                  </pic:spPr>
+                </pic:pic>
+              </a:graphicData>
+            </a:graphic>
+          </wp:anchor>
+        </w:drawing>
+      </w:r>
+      <w:r>
+        <mc:AlternateContent>
+          <mc:Choice Requires="wps">
+            <w:drawing>
+              <wp:anchor distT="0" distB="0" distL="114300" distR="114300" simplePos="0" relativeHeight="251683840" behindDoc="0" locked="0" layoutInCell="1" allowOverlap="1" wp14:anchorId="1B1AAD1B" wp14:editId="73EE909F">
+                <wp:simplePos x="0" y="0"/>
+                <wp:positionH relativeFrom="column">
+                  <wp:posOffset>3201035</wp:posOffset>
+                </wp:positionH>
+                <wp:positionV relativeFrom="paragraph">
+                  <wp:posOffset>1903095</wp:posOffset>
+                </wp:positionV>
+                <wp:extent cx="2268855" cy="257810"/>
+                <wp:effectExtent l="0" t="0" r="17145" b="27940"/>
+                <wp:wrapNone/>
+                <wp:docPr id="3" name="Rectangle : coins arrondis 2">
+                  <a:extLst xmlns:a="http://schemas.openxmlformats.org/drawingml/2006/main">
+                    <a:ext uri="{FF2B5EF4-FFF2-40B4-BE49-F238E27FC236}">
+                      <a16:creationId xmlns:a16="http://schemas.microsoft.com/office/drawing/2014/main" id="{FCCFC09C-9FAC-348D-437B-B46A9E8C43C7}"/>
+                    </a:ext>
+                  </a:extLst>
+                </wp:docPr>
+                <wp:cNvGraphicFramePr/>
+                <a:graphic xmlns:a="http://schemas.openxmlformats.org/drawingml/2006/main">
+                  <a:graphicData uri="http://schemas.microsoft.com/office/word/2010/wordprocessingShape">
+                    <wps:wsp>
+                      <wps:cNvSpPr/>
+                      <wps:spPr>
+                        <a:xfrm>
+                          <a:off x="0" y="0"/>
+                          <a:ext cx="2268855" cy="257810"/>
+                        </a:xfrm>
+                        <a:prstGeom prst="roundRect">
+                          <a:avLst/>
+                        </a:prstGeom>
+                        <a:noFill/>
+                        <a:ln>
+                          <a:solidFill>
+                            <a:schemeClr val="tx1"/>
+                          </a:solidFill>
+                        </a:ln>
+                      </wps:spPr>
+                      <wps:style>
+                        <a:lnRef idx="2">
+                          <a:schemeClr val="accent1">
+                            <a:shade val="15000"/>
+                          </a:schemeClr>
+                        </a:lnRef>
+                        <a:fillRef idx="1">
+                          <a:schemeClr val="accent1"/>
+                        </a:fillRef>
+                        <a:effectRef idx="0">
+                          <a:schemeClr val="accent1"/>
+                        </a:effectRef>
+                        <a:fontRef idx="minor">
+                          <a:schemeClr val="lt1"/>
+                        </a:fontRef>
+                      </wps:style>
+                      <wps:txbx>
+                        <w:txbxContent>
+                          <w:p>
+                            <w:pPr>
+                              <w:jc w:val="center"/>
+                              <w:rPr>
+                                <w:rFonts w:hAnsi="Calibri"/>
+                                <w:color w:val="000000" w:themeColor="text1"/>
+                                <w:kern w:val="24"/>
+                                <w:sz w:val="20"/>
+                                <w:szCs w:val="20"/>
+                                <w14:ligatures w14:val="none"/>
+                              </w:rPr>
+                            </w:pPr>
+                            <w:r>
+                              <w:rPr>
+                                <w:rFonts w:hAnsi="Calibri"/>
+                                <w:color w:val="000000" w:themeColor="text1"/>
+                                <w:kern w:val="24"/>
+                                <w:sz w:val="20"/>
+                                <w:szCs w:val="20"/>
+                              </w:rPr>
+                              <w:t>Repère table</w:t>
+                            </w:r>
+                          </w:p>
+                        </w:txbxContent>
+                      </wps:txbx>
+                      <wps:bodyPr rtlCol="0" anchor="ctr"/>
+                    </wps:wsp>
+                  </a:graphicData>
+                </a:graphic>
+              </wp:anchor>
+            </w:drawing>
+          </mc:Choice>
+          <mc:Fallback>
+            <w:pict>
+              <v:roundrect w14:anchorId="1B1AAD1B" id="Rectangle : coins arrondis 2" o:spid="_x0000_s1027" style="position:absolute;margin-left:252.05pt;margin-top:149.85pt;width:178.65pt;height:20.3pt;z-index:251683840;visibility:visible;mso-wrap-style:square;mso-wrap-distance-left:9pt;mso-wrap-distance-top:0;mso-wrap-distance-right:9pt;mso-wrap-distance-bottom:0;mso-position-horizontal:absolute;mso-position-horizontal-relative:text;mso-position-vertical:absolute;mso-position-vertical-relative:text;v-text-anchor:middle" arcsize="10923f" o:gfxdata="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" filled="f" strokecolor="black [3213]" strokeweight="1pt">
+                <v:stroke joinstyle="miter"/>
+                <v:textbox>
+                  <w:txbxContent>
+                    <w:p>
+                      <w:pPr>
+                        <w:jc w:val="center"/>
+                        <w:rPr>
+                          <w:rFonts w:hAnsi="Calibri"/>
+                          <w:color w:val="000000" w:themeColor="text1"/>
+                          <w:kern w:val="24"/>
+                          <w:sz w:val="20"/>
+                          <w:szCs w:val="20"/>
+                          <w14:ligatures w14:val="none"/>
+                        </w:rPr>
+                      </w:pPr>
+                      <w:r>
+                        <w:rPr>
+                          <w:rFonts w:hAnsi="Calibri"/>
+                          <w:color w:val="000000" w:themeColor="text1"/>
+                          <w:kern w:val="24"/>
+                          <w:sz w:val="20"/>
+                          <w:szCs w:val="20"/>
+                        </w:rPr>
+                        <w:t>Repère table</w:t>
+                      </w:r>
+                    </w:p>
+                  </w:txbxContent>
+                </v:textbox>
+              </v:roundrect>
+            </w:pict>
+          </mc:Fallback>
+        </mc:AlternateContent>
+      </w:r>
+    </w:p>
+    <w:p>
+      <w:pPr>
+        <w:spacing w:after="0"/>
+        <w:rPr>
+          <w:lang w:val="en-GB"/>
+        </w:rPr>
+      </w:pPr>
+    </w:p>
+    <w:p>
+      <w:pPr>
+        <w:spacing w:after="0"/>
+        <w:rPr>
+          <w:lang w:val="en-GB"/>
+        </w:rPr>
+      </w:pPr>
+    </w:p>
+    <w:p>
+      <w:pPr>
+        <w:spacing w:after="0"/>
+        <w:rPr>
+          <w:lang w:val="en-GB"/>
+        </w:rPr>
+      </w:pPr>
+    </w:p>
+    <w:p>
+      <w:pPr>
+        <w:spacing w:after="0"/>
+        <w:rPr>
+          <w:lang w:val="en-GB"/>
+        </w:rPr>
+      </w:pPr>
+    </w:p>
+    <w:p>
+      <w:pPr>
+        <w:spacing w:after="0"/>
+        <w:rPr>
+          <w:lang w:val="en-GB"/>
+        </w:rPr>
+      </w:pPr>
+    </w:p>
+    <w:p>
+      <w:pPr>
+        <w:spacing w:after="0"/>
+        <w:rPr>
+          <w:lang w:val="en-GB"/>
+        </w:rPr>
+      </w:pPr>
+    </w:p>
+    <w:p>
+      <w:pPr>
+        <w:spacing w:after="0"/>
+        <w:rPr>
+          <w:lang w:val="en-GB"/>
+        </w:rPr>
+      </w:pPr>
+    </w:p>
+    <w:p>
+      <w:pPr>
+        <w:spacing w:after="0"/>
+        <w:rPr>
+          <w:lang w:val="en-GB"/>
+        </w:rPr>
+      </w:pPr>
+    </w:p>
+    <w:p>
+      <w:pPr>
+        <w:spacing w:after="0"/>
+        <w:rPr>
+          <w:lang w:val="en-GB"/>
+        </w:rPr>
+      </w:pPr>
+    </w:p>
+    <w:p>
+      <w:pPr>
+        <w:spacing w:after="0"/>
+        <w:rPr>
+          <w:lang w:val="en-GB"/>
+        </w:rPr>
+      </w:pPr>
+    </w:p>
+    <w:p>
+      <w:pPr>
+        <w:spacing w:after="0"/>
+        <w:rPr>
+          <w:lang w:val="en-GB"/>
+        </w:rPr>
+      </w:pPr>
+    </w:p>
+    <w:p>
+      <w:pPr>
+        <w:spacing w:after="0"/>
+        <w:rPr>
+          <w:lang w:val="en-GB"/>
+        </w:rPr>
+      </w:pPr>
+    </w:p>
+    <w:p>
+      <w:pPr>
+        <w:spacing w:after="0"/>
+        <w:rPr>
+          <w:lang w:val="en-GB"/>
+        </w:rPr>
+      </w:pPr>
+    </w:p>
+    <w:p>
+      <w:pPr>
+        <w:spacing w:after="0"/>
+        <w:rPr>
+          <w:lang w:val="en-GB"/>
+        </w:rPr>
+      </w:pPr>
+    </w:p>
+    <w:p>
+      <w:pPr>
+        <w:spacing w:after="0"/>
+        <w:rPr>
+          <w:lang w:val="en-GB"/>
+        </w:rPr>
+      </w:pPr>
+    </w:p>
+    <w:p>
+      <w:pPr>
+        <w:spacing w:after="0"/>
+        <w:rPr>
+          <w:lang w:val="en-GB"/>
+        </w:rPr>
+      </w:pPr>
+      <w:r>
+        <mc:AlternateContent>
+          <mc:Choice Requires="wps">
+            <w:drawing>
+              <wp:anchor distT="0" distB="0" distL="114300" distR="114300" simplePos="0" relativeHeight="251687936" behindDoc="0" locked="0" layoutInCell="1" allowOverlap="1" wp14:anchorId="46C484F8" wp14:editId="7C2DFD67">
+                <wp:simplePos x="0" y="0"/>
+                <wp:positionH relativeFrom="column">
+                  <wp:posOffset>0</wp:posOffset>
+                </wp:positionH>
+                <wp:positionV relativeFrom="paragraph">
+                  <wp:posOffset>467360</wp:posOffset>
+                </wp:positionV>
+                <wp:extent cx="1897734" cy="542660"/>
+                <wp:effectExtent l="0" t="0" r="26670" b="10160"/>
+                <wp:wrapNone/>
+                <wp:docPr id="770855437" name="Rectangle : coins arrondis 4"/>
+                <wp:cNvGraphicFramePr xmlns:a="http://schemas.openxmlformats.org/drawingml/2006/main"/>
+                <a:graphic xmlns:a="http://schemas.openxmlformats.org/drawingml/2006/main">
+                  <a:graphicData uri="http://schemas.microsoft.com/office/word/2010/wordprocessingShape">
+                    <wps:wsp>
+                      <wps:cNvSpPr/>
+                      <wps:spPr>
+                        <a:xfrm>
+                          <a:off x="0" y="0"/>
+                          <a:ext cx="1897734" cy="542660"/>
+                        </a:xfrm>
+                        <a:prstGeom prst="roundRect">
+                          <a:avLst/>
+                        </a:prstGeom>
+                        <a:noFill/>
+                        <a:ln>
+                          <a:solidFill>
+                            <a:schemeClr val="tx1"/>
+                          </a:solidFill>
+                        </a:ln>
+                      </wps:spPr>
+                      <wps:style>
+                        <a:lnRef idx="2">
+                          <a:schemeClr val="accent1">
+                            <a:shade val="15000"/>
+                          </a:schemeClr>
+                        </a:lnRef>
+                        <a:fillRef idx="1">
+                          <a:schemeClr val="accent1"/>
+                        </a:fillRef>
+                        <a:effectRef idx="0">
+                          <a:schemeClr val="accent1"/>
+                        </a:effectRef>
+                        <a:fontRef idx="minor">
+                          <a:schemeClr val="lt1"/>
+                        </a:fontRef>
+                      </wps:style>
+                      <wps:txbx>
+                        <w:txbxContent>
+                          <w:p>
+                            <w:pPr>
+                              <w:jc w:val="center"/>
+                              <w:rPr>
+                                <w:rFonts w:hAnsi="Calibri"/>
+                                <w:color w:val="000000" w:themeColor="text1"/>
+                                <w:kern w:val="24"/>
+                                <w:sz w:val="20"/>
+                                <w:szCs w:val="20"/>
+                                <w14:ligatures w14:val="none"/>
+                              </w:rPr>
+                            </w:pPr>
+                            <w:r>
+                              <w:rPr>
+                                <w:rFonts w:hAnsi="Calibri"/>
+                                <w:color w:val="000000" w:themeColor="text1"/>
+                                <w:kern w:val="24"/>
+                                <w:sz w:val="20"/>
+                                <w:szCs w:val="20"/>
+                              </w:rPr>
+                              <w:t>Trouver coordonnée  des QR code balise dans repère caméra</w:t>
+                            </w:r>
+                          </w:p>
+                        </w:txbxContent>
+                      </wps:txbx>
+                      <wps:bodyPr rtlCol="0" anchor="ctr"/>
+                    </wps:wsp>
+                  </a:graphicData>
+                </a:graphic>
+              </wp:anchor>
+            </w:drawing>
+          </mc:Choice>
+          <mc:Fallback>
+            <w:pict>
+              <v:roundrect w14:anchorId="46C484F8" id="Rectangle : coins arrondis 4" o:spid="_x0000_s1028" style="position:absolute;margin-left:0;margin-top:36.8pt;width:149.45pt;height:42.75pt;z-index:251687936;visibility:visible;mso-wrap-style:square;mso-wrap-distance-left:9pt;mso-wrap-distance-top:0;mso-wrap-distance-right:9pt;mso-wrap-distance-bottom:0;mso-position-horizontal:absolute;mso-position-horizontal-relative:text;mso-position-vertical:absolute;mso-position-vertical-relative:text;v-text-anchor:middle" arcsize="10923f" o:gfxdata="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" filled="f" strokecolor="black [3213]" strokeweight="1pt">
+                <v:stroke joinstyle="miter"/>
+                <v:textbox>
+                  <w:txbxContent>
+                    <w:p>
+                      <w:pPr>
+                        <w:jc w:val="center"/>
+                        <w:rPr>
+                          <w:rFonts w:hAnsi="Calibri"/>
+                          <w:color w:val="000000" w:themeColor="text1"/>
+                          <w:kern w:val="24"/>
+                          <w:sz w:val="20"/>
+                          <w:szCs w:val="20"/>
+                          <w14:ligatures w14:val="none"/>
+                        </w:rPr>
+                      </w:pPr>
+                      <w:r>
+                        <w:rPr>
+                          <w:rFonts w:hAnsi="Calibri"/>
+                          <w:color w:val="000000" w:themeColor="text1"/>
+                          <w:kern w:val="24"/>
+                          <w:sz w:val="20"/>
+                          <w:szCs w:val="20"/>
+                        </w:rPr>
+                        <w:t>Trouver coordonnée  des QR code balise dans repère caméra</w:t>
+                      </w:r>
+                    </w:p>
+                  </w:txbxContent>
+                </v:textbox>
+              </v:roundrect>
+            </w:pict>
+          </mc:Fallback>
+        </mc:AlternateContent>
+      </w:r>
+      <w:r>
+        <mc:AlternateContent>
+          <mc:Choice Requires="wps">
+            <w:drawing>
+              <wp:anchor distT="0" distB="0" distL="114300" distR="114300" simplePos="0" relativeHeight="251688960" behindDoc="0" locked="0" layoutInCell="1" allowOverlap="1" wp14:anchorId="0B5F4272" wp14:editId="6084C3CA">
+                <wp:simplePos x="0" y="0"/>
+                <wp:positionH relativeFrom="column">
+                  <wp:posOffset>0</wp:posOffset>
+                </wp:positionH>
+                <wp:positionV relativeFrom="paragraph">
+                  <wp:posOffset>1247775</wp:posOffset>
+                </wp:positionV>
+                <wp:extent cx="1897734" cy="542660"/>
+                <wp:effectExtent l="0" t="0" r="26670" b="10160"/>
+                <wp:wrapNone/>
+                <wp:docPr id="643206034" name="Rectangle : coins arrondis 7"/>
+                <wp:cNvGraphicFramePr xmlns:a="http://schemas.openxmlformats.org/drawingml/2006/main"/>
+                <a:graphic xmlns:a="http://schemas.openxmlformats.org/drawingml/2006/main">
+                  <a:graphicData uri="http://schemas.microsoft.com/office/word/2010/wordprocessingShape">
+                    <wps:wsp>
+                      <wps:cNvSpPr/>
+                      <wps:spPr>
+                        <a:xfrm>
+                          <a:off x="0" y="0"/>
+                          <a:ext cx="1897734" cy="542660"/>
+                        </a:xfrm>
+                        <a:prstGeom prst="roundRect">
+                          <a:avLst/>
+                        </a:prstGeom>
+                        <a:noFill/>
+                        <a:ln>
+                          <a:solidFill>
+                            <a:schemeClr val="tx1"/>
+                          </a:solidFill>
+                        </a:ln>
+                      </wps:spPr>
+                      <wps:style>
+                        <a:lnRef idx="2">
+                          <a:schemeClr val="accent1">
+                            <a:shade val="15000"/>
+                          </a:schemeClr>
+                        </a:lnRef>
+                        <a:fillRef idx="1">
+                          <a:schemeClr val="accent1"/>
+                        </a:fillRef>
+                        <a:effectRef idx="0">
+                          <a:schemeClr val="accent1"/>
+                        </a:effectRef>
+                        <a:fontRef idx="minor">
+                          <a:schemeClr val="lt1"/>
+                        </a:fontRef>
+                      </wps:style>
+                      <wps:txbx>
+                        <w:txbxContent>
+                          <w:p>
+                            <w:pPr>
+                              <w:jc w:val="center"/>
+                              <w:rPr>
+                                <w:rFonts w:hAnsi="Calibri"/>
+                                <w:color w:val="000000" w:themeColor="text1"/>
+                                <w:kern w:val="24"/>
+                                <w:sz w:val="20"/>
+                                <w:szCs w:val="20"/>
+                                <w14:ligatures w14:val="none"/>
+                              </w:rPr>
+                            </w:pPr>
+                            <w:r>
+                              <w:rPr>
+                                <w:rFonts w:hAnsi="Calibri"/>
+                                <w:color w:val="000000" w:themeColor="text1"/>
+                                <w:kern w:val="24"/>
+                                <w:sz w:val="20"/>
+                                <w:szCs w:val="20"/>
+                              </w:rPr>
+                              <w:t>Trouver coordonnée  des zones dans repère caméra</w:t>
+                            </w:r>
+                          </w:p>
+                        </w:txbxContent>
+                      </wps:txbx>
+                      <wps:bodyPr rtlCol="0" anchor="ctr"/>
+                    </wps:wsp>
+                  </a:graphicData>
+                </a:graphic>
+              </wp:anchor>
+            </w:drawing>
+          </mc:Choice>
+          <mc:Fallback>
+            <w:pict>
+              <v:roundrect w14:anchorId="0B5F4272" id="Rectangle : coins arrondis 7" o:spid="_x0000_s1029" style="position:absolute;margin-left:0;margin-top:98.25pt;width:149.45pt;height:42.75pt;z-index:251688960;visibility:visible;mso-wrap-style:square;mso-wrap-distance-left:9pt;mso-wrap-distance-top:0;mso-wrap-distance-right:9pt;mso-wrap-distance-bottom:0;mso-position-horizontal:absolute;mso-position-horizontal-relative:text;mso-position-vertical:absolute;mso-position-vertical-relative:text;v-text-anchor:middle" arcsize="10923f" o:gfxdata="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" filled="f" strokecolor="black [3213]" strokeweight="1pt">
+                <v:stroke joinstyle="miter"/>
+                <v:textbox>
+                  <w:txbxContent>
+                    <w:p>
+                      <w:pPr>
+                        <w:jc w:val="center"/>
+                        <w:rPr>
+                          <w:rFonts w:hAnsi="Calibri"/>
+                          <w:color w:val="000000" w:themeColor="text1"/>
+                          <w:kern w:val="24"/>
+                          <w:sz w:val="20"/>
+                          <w:szCs w:val="20"/>
+                          <w14:ligatures w14:val="none"/>
+                        </w:rPr>
+                      </w:pPr>
+                      <w:r>
+                        <w:rPr>
+                          <w:rFonts w:hAnsi="Calibri"/>
+                          <w:color w:val="000000" w:themeColor="text1"/>
+                          <w:kern w:val="24"/>
+                          <w:sz w:val="20"/>
+                          <w:szCs w:val="20"/>
+                        </w:rPr>
+                        <w:t>Trouver coordonnée  des zones dans repère caméra</w:t>
+                      </w:r>
+                    </w:p>
+                  </w:txbxContent>
+                </v:textbox>
+              </v:roundrect>
+            </w:pict>
+          </mc:Fallback>
+        </mc:AlternateContent>
+      </w:r>
+      <w:r>
+        <mc:AlternateContent>
+          <mc:Choice Requires="wps">
+            <w:drawing>
+              <wp:anchor distT="0" distB="0" distL="114300" distR="114300" simplePos="0" relativeHeight="251689984" behindDoc="0" locked="0" layoutInCell="1" allowOverlap="1" wp14:anchorId="6057F4F2" wp14:editId="295CDC94">
+                <wp:simplePos x="0" y="0"/>
+                <wp:positionH relativeFrom="column">
+                  <wp:posOffset>948690</wp:posOffset>
+                </wp:positionH>
+                <wp:positionV relativeFrom="paragraph">
+                  <wp:posOffset>1009650</wp:posOffset>
+                </wp:positionV>
+                <wp:extent cx="0" cy="238127"/>
+                <wp:effectExtent l="76200" t="0" r="57150" b="47625"/>
+                <wp:wrapNone/>
+                <wp:docPr id="10" name="Connecteur droit avec flèche 9">
+                  <a:extLst xmlns:a="http://schemas.openxmlformats.org/drawingml/2006/main">
+                    <a:ext uri="{FF2B5EF4-FFF2-40B4-BE49-F238E27FC236}">
+                      <a16:creationId xmlns:a16="http://schemas.microsoft.com/office/drawing/2014/main" id="{6819A79A-7121-3822-A9D7-C013565ECBA7}"/>
+                    </a:ext>
+                  </a:extLst>
+                </wp:docPr>
+                <wp:cNvGraphicFramePr>
+                  <a:graphicFrameLocks xmlns:a="http://schemas.openxmlformats.org/drawingml/2006/main"/>
+                </wp:cNvGraphicFramePr>
+                <a:graphic xmlns:a="http://schemas.openxmlformats.org/drawingml/2006/main">
+                  <a:graphicData uri="http://schemas.microsoft.com/office/word/2010/wordprocessingShape">
+                    <wps:wsp>
+                      <wps:cNvCnPr>
+                        <a:cxnSpLocks/>
+                      </wps:cNvCnPr>
+                      <wps:spPr>
+                        <a:xfrm>
+                          <a:off x="0" y="0"/>
+                          <a:ext cx="0" cy="238127"/>
+                        </a:xfrm>
+                        <a:prstGeom prst="straightConnector1">
+                          <a:avLst/>
+                        </a:prstGeom>
+                        <a:ln>
+                          <a:solidFill>
+                            <a:schemeClr val="tx1"/>
+                          </a:solidFill>
+                          <a:tailEnd type="triangle"/>
+                        </a:ln>
+                      </wps:spPr>
+                      <wps:style>
+                        <a:lnRef idx="2">
+                          <a:schemeClr val="accent1"/>
+                        </a:lnRef>
+                        <a:fillRef idx="0">
+                          <a:schemeClr val="accent1"/>
+                        </a:fillRef>
+                        <a:effectRef idx="1">
+                          <a:schemeClr val="accent1"/>
+                        </a:effectRef>
+                        <a:fontRef idx="minor">
+                          <a:schemeClr val="tx1"/>
+                        </a:fontRef>
+                      </wps:style>
+                      <wps:bodyPr/>
+                    </wps:wsp>
+                  </a:graphicData>
+                </a:graphic>
+              </wp:anchor>
+            </w:drawing>
+          </mc:Choice>
+          <mc:Fallback>
+            <w:pict>
+              <v:shapetype w14:anchorId="495BA224" id="_x0000_t32" coordsize="21600,21600" o:spt="32" o:oned="t" path="m,l21600,21600e" filled="f">
+                <v:path arrowok="t" fillok="f" o:connecttype="none"/>
+                <o:lock v:ext="edit" shapetype="t"/>
+              </v:shapetype>
+              <v:shape id="Connecteur droit avec flèche 9" o:spid="_x0000_s1026" type="#_x0000_t32" style="position:absolute;margin-left:74.7pt;margin-top:79.5pt;width:0;height:18.75pt;z-index:251689984;visibility:visible;mso-wrap-style:square;mso-wrap-distance-left:9pt;mso-wrap-distance-top:0;mso-wrap-distance-right:9pt;mso-wrap-distance-bottom:0;mso-position-horizontal:absolute;mso-position-horizontal-relative:text;mso-position-vertical:absolute;mso-position-vertical-relative:text" o:gfxdata="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" strokecolor="black [3213]" strokeweight="1pt">
+                <v:stroke endarrow="block" joinstyle="miter"/>
+                <o:lock v:ext="edit" shapetype="f"/>
+              </v:shape>
+            </w:pict>
+          </mc:Fallback>
+        </mc:AlternateContent>
+      </w:r>
+      <w:r>
+        <mc:AlternateContent>
+          <mc:Choice Requires="wps">
+            <w:drawing>
+              <wp:anchor distT="0" distB="0" distL="114300" distR="114300" simplePos="0" relativeHeight="251691008" behindDoc="0" locked="0" layoutInCell="1" allowOverlap="1" wp14:anchorId="6A86EC7C" wp14:editId="552B3F44">
+                <wp:simplePos x="0" y="0"/>
+                <wp:positionH relativeFrom="column">
+                  <wp:posOffset>948690</wp:posOffset>
+                </wp:positionH>
+                <wp:positionV relativeFrom="paragraph">
+                  <wp:posOffset>1790700</wp:posOffset>
+                </wp:positionV>
+                <wp:extent cx="0" cy="238127"/>
+                <wp:effectExtent l="76200" t="0" r="57150" b="47625"/>
+                <wp:wrapNone/>
+                <wp:docPr id="1090304057" name="Connecteur droit avec flèche 13"/>
+                <wp:cNvGraphicFramePr xmlns:a="http://schemas.openxmlformats.org/drawingml/2006/main">
+                  <a:graphicFrameLocks xmlns:a="http://schemas.openxmlformats.org/drawingml/2006/main"/>
+                </wp:cNvGraphicFramePr>
+                <a:graphic xmlns:a="http://schemas.openxmlformats.org/drawingml/2006/main">
+                  <a:graphicData uri="http://schemas.microsoft.com/office/word/2010/wordprocessingShape">
+                    <wps:wsp>
+                      <wps:cNvCnPr>
+                        <a:cxnSpLocks/>
+                      </wps:cNvCnPr>
+                      <wps:spPr>
+                        <a:xfrm>
+                          <a:off x="0" y="0"/>
+                          <a:ext cx="0" cy="238127"/>
+                        </a:xfrm>
+                        <a:prstGeom prst="straightConnector1">
+                          <a:avLst/>
+                        </a:prstGeom>
+                        <a:ln>
+                          <a:solidFill>
+                            <a:schemeClr val="tx1"/>
+                          </a:solidFill>
+                          <a:tailEnd type="triangle"/>
+                        </a:ln>
+                      </wps:spPr>
+                      <wps:style>
+                        <a:lnRef idx="2">
+                          <a:schemeClr val="accent1"/>
+                        </a:lnRef>
+                        <a:fillRef idx="0">
+                          <a:schemeClr val="accent1"/>
+                        </a:fillRef>
+                        <a:effectRef idx="1">
+                          <a:schemeClr val="accent1"/>
+                        </a:effectRef>
+                        <a:fontRef idx="minor">
+                          <a:schemeClr val="tx1"/>
+                        </a:fontRef>
+                      </wps:style>
+                      <wps:bodyPr/>
+                    </wps:wsp>
+                  </a:graphicData>
+                </a:graphic>
+              </wp:anchor>
+            </w:drawing>
+          </mc:Choice>
+          <mc:Fallback>
+            <w:pict>
+              <v:shape w14:anchorId="471CB686" id="Connecteur droit avec flèche 13" o:spid="_x0000_s1026" type="#_x0000_t32" style="position:absolute;margin-left:74.7pt;margin-top:141pt;width:0;height:18.75pt;z-index:251691008;visibility:visible;mso-wrap-style:square;mso-wrap-distance-left:9pt;mso-wrap-distance-top:0;mso-wrap-distance-right:9pt;mso-wrap-distance-bottom:0;mso-position-horizontal:absolute;mso-position-horizontal-relative:text;mso-position-vertical:absolute;mso-position-vertical-relative:text" o:gfxdata="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" strokecolor="black [3213]" strokeweight="1pt">
+                <v:stroke endarrow="block" joinstyle="miter"/>
+                <o:lock v:ext="edit" shapetype="f"/>
+              </v:shape>
+            </w:pict>
+          </mc:Fallback>
+        </mc:AlternateContent>
+      </w:r>
+      <w:r>
+        <mc:AlternateContent>
+          <mc:Choice Requires="wps">
+            <w:drawing>
+              <wp:anchor distT="0" distB="0" distL="114300" distR="114300" simplePos="0" relativeHeight="251692032" behindDoc="0" locked="0" layoutInCell="1" allowOverlap="1" wp14:anchorId="7726F4F5" wp14:editId="2C90525E">
+                <wp:simplePos x="0" y="0"/>
+                <wp:positionH relativeFrom="column">
+                  <wp:posOffset>0</wp:posOffset>
+                </wp:positionH>
+                <wp:positionV relativeFrom="paragraph">
+                  <wp:posOffset>2028825</wp:posOffset>
+                </wp:positionV>
+                <wp:extent cx="1897734" cy="542660"/>
+                <wp:effectExtent l="0" t="0" r="26670" b="10160"/>
+                <wp:wrapNone/>
+                <wp:docPr id="501860721" name="Rectangle : coins arrondis 15"/>
+                <wp:cNvGraphicFramePr xmlns:a="http://schemas.openxmlformats.org/drawingml/2006/main"/>
+                <a:graphic xmlns:a="http://schemas.openxmlformats.org/drawingml/2006/main">
+                  <a:graphicData uri="http://schemas.microsoft.com/office/word/2010/wordprocessingShape">
+                    <wps:wsp>
+                      <wps:cNvSpPr/>
+                      <wps:spPr>
+                        <a:xfrm>
+                          <a:off x="0" y="0"/>
+                          <a:ext cx="1897734" cy="542660"/>
+                        </a:xfrm>
+                        <a:prstGeom prst="roundRect">
+                          <a:avLst/>
+                        </a:prstGeom>
+                        <a:noFill/>
+                        <a:ln>
+                          <a:solidFill>
+                            <a:schemeClr val="tx1"/>
+                          </a:solidFill>
+                        </a:ln>
+                      </wps:spPr>
+                      <wps:style>
+                        <a:lnRef idx="2">
+                          <a:schemeClr val="accent1">
+                            <a:shade val="15000"/>
+                          </a:schemeClr>
+                        </a:lnRef>
+                        <a:fillRef idx="1">
+                          <a:schemeClr val="accent1"/>
+                        </a:fillRef>
+                        <a:effectRef idx="0">
+                          <a:schemeClr val="accent1"/>
+                        </a:effectRef>
+                        <a:fontRef idx="minor">
+                          <a:schemeClr val="lt1"/>
+                        </a:fontRef>
+                      </wps:style>
+                      <wps:txbx>
+                        <w:txbxContent>
+                          <w:p>
+                            <w:pPr>
+                              <w:jc w:val="center"/>
+                              <w:rPr>
+                                <w:rFonts w:hAnsi="Calibri"/>
+                                <w:color w:val="000000" w:themeColor="text1"/>
+                                <w:kern w:val="24"/>
+                                <w:sz w:val="20"/>
+                                <w:szCs w:val="20"/>
+                                <w14:ligatures w14:val="none"/>
+                              </w:rPr>
+                            </w:pPr>
+                            <w:r>
+                              <w:rPr>
+                                <w:rFonts w:hAnsi="Calibri"/>
+                                <w:color w:val="000000" w:themeColor="text1"/>
+                                <w:kern w:val="24"/>
+                                <w:sz w:val="20"/>
+                                <w:szCs w:val="20"/>
+                              </w:rPr>
+                              <w:t>Regarder dans la zone réduite des zones de déposes élargies où si qr code boîte</w:t>
+                            </w:r>
+                          </w:p>
+                        </w:txbxContent>
+                      </wps:txbx>
+                      <wps:bodyPr rtlCol="0" anchor="ctr"/>
+                    </wps:wsp>
+                  </a:graphicData>
+                </a:graphic>
+              </wp:anchor>
+            </w:drawing>
+          </mc:Choice>
+          <mc:Fallback>
+            <w:pict>
+              <v:roundrect w14:anchorId="7726F4F5" id="Rectangle : coins arrondis 15" o:spid="_x0000_s1030" style="position:absolute;margin-left:0;margin-top:159.75pt;width:149.45pt;height:42.75pt;z-index:251692032;visibility:visible;mso-wrap-style:square;mso-wrap-distance-left:9pt;mso-wrap-distance-top:0;mso-wrap-distance-right:9pt;mso-wrap-distance-bottom:0;mso-position-horizontal:absolute;mso-position-horizontal-relative:text;mso-position-vertical:absolute;mso-position-vertical-relative:text;v-text-anchor:middle" arcsize="10923f" o:gfxdata="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" filled="f" strokecolor="black [3213]" strokeweight="1pt">
+                <v:stroke joinstyle="miter"/>
+                <v:textbox>
+                  <w:txbxContent>
+                    <w:p>
+                      <w:pPr>
+                        <w:jc w:val="center"/>
+                        <w:rPr>
+                          <w:rFonts w:hAnsi="Calibri"/>
+                          <w:color w:val="000000" w:themeColor="text1"/>
+                          <w:kern w:val="24"/>
+                          <w:sz w:val="20"/>
+                          <w:szCs w:val="20"/>
+                          <w14:ligatures w14:val="none"/>
+                        </w:rPr>
+                      </w:pPr>
+                      <w:r>
+                        <w:rPr>
+                          <w:rFonts w:hAnsi="Calibri"/>
+                          <w:color w:val="000000" w:themeColor="text1"/>
+                          <w:kern w:val="24"/>
+                          <w:sz w:val="20"/>
+                          <w:szCs w:val="20"/>
+                        </w:rPr>
+                        <w:t>Regarder dans la zone réduite des zones de déposes élargies où si qr code boîte</w:t>
+                      </w:r>
+                    </w:p>
+                  </w:txbxContent>
+                </v:textbox>
+              </v:roundrect>
+            </w:pict>
+          </mc:Fallback>
+        </mc:AlternateContent>
+      </w:r>
+      <w:r>
+        <mc:AlternateContent>
+          <mc:Choice Requires="wps">
+            <w:drawing>
+              <wp:anchor distT="0" distB="0" distL="114300" distR="114300" simplePos="0" relativeHeight="251693056" behindDoc="0" locked="0" layoutInCell="1" allowOverlap="1" wp14:anchorId="37B4A143" wp14:editId="279B5B43">
+                <wp:simplePos x="0" y="0"/>
+                <wp:positionH relativeFrom="column">
+                  <wp:posOffset>2773680</wp:posOffset>
+                </wp:positionH>
+                <wp:positionV relativeFrom="paragraph">
+                  <wp:posOffset>462280</wp:posOffset>
+                </wp:positionV>
+                <wp:extent cx="1687542" cy="552819"/>
+                <wp:effectExtent l="0" t="0" r="27305" b="19050"/>
+                <wp:wrapNone/>
+                <wp:docPr id="1440138006" name="Rectangle : coins arrondis 19"/>
+                <wp:cNvGraphicFramePr xmlns:a="http://schemas.openxmlformats.org/drawingml/2006/main"/>
+                <a:graphic xmlns:a="http://schemas.openxmlformats.org/drawingml/2006/main">
+                  <a:graphicData uri="http://schemas.microsoft.com/office/word/2010/wordprocessingShape">
+                    <wps:wsp>
+                      <wps:cNvSpPr/>
+                      <wps:spPr>
+                        <a:xfrm>
+                          <a:off x="0" y="0"/>
+                          <a:ext cx="1687542" cy="552819"/>
+                        </a:xfrm>
+                        <a:prstGeom prst="roundRect">
+                          <a:avLst/>
+                        </a:prstGeom>
+                        <a:solidFill>
+                          <a:schemeClr val="tx2">
+                            <a:lumMod val="10000"/>
+                            <a:lumOff val="90000"/>
+                          </a:schemeClr>
+                        </a:solidFill>
+                        <a:ln>
+                          <a:solidFill>
+                            <a:schemeClr val="tx1"/>
+                          </a:solidFill>
+                        </a:ln>
+                      </wps:spPr>
+                      <wps:style>
+                        <a:lnRef idx="2">
+                          <a:schemeClr val="accent1">
+                            <a:shade val="15000"/>
+                          </a:schemeClr>
+                        </a:lnRef>
+                        <a:fillRef idx="1">
+                          <a:schemeClr val="accent1"/>
+                        </a:fillRef>
+                        <a:effectRef idx="0">
+                          <a:schemeClr val="accent1"/>
+                        </a:effectRef>
+                        <a:fontRef idx="minor">
+                          <a:schemeClr val="lt1"/>
+                        </a:fontRef>
+                      </wps:style>
+                      <wps:txbx>
+                        <w:txbxContent>
+                          <w:p>
+                            <w:pPr>
+                              <w:jc w:val="center"/>
+                              <w:rPr>
+                                <w:rFonts w:hAnsi="Calibri"/>
+                                <w:color w:val="000000" w:themeColor="text1"/>
+                                <w:kern w:val="24"/>
+                                <w:sz w:val="20"/>
+                                <w:szCs w:val="20"/>
+                                <w14:ligatures w14:val="none"/>
+                              </w:rPr>
+                            </w:pPr>
+                            <w:r>
+                              <w:rPr>
+                                <w:rFonts w:hAnsi="Calibri"/>
+                                <w:color w:val="000000" w:themeColor="text1"/>
+                                <w:kern w:val="24"/>
+                                <w:sz w:val="20"/>
+                                <w:szCs w:val="20"/>
+                              </w:rPr>
+                              <w:t>Coordonnées des balises dans repère caméra</w:t>
+                            </w:r>
+                          </w:p>
+                        </w:txbxContent>
+                      </wps:txbx>
+                      <wps:bodyPr rtlCol="0" anchor="ctr"/>
+                    </wps:wsp>
+                  </a:graphicData>
+                </a:graphic>
+              </wp:anchor>
+            </w:drawing>
+          </mc:Choice>
+          <mc:Fallback>
+            <w:pict>
+              <v:roundrect w14:anchorId="37B4A143" id="Rectangle : coins arrondis 19" o:spid="_x0000_s1031" style="position:absolute;margin-left:218.4pt;margin-top:36.4pt;width:132.9pt;height:43.55pt;z-index:251693056;visibility:visible;mso-wrap-style:square;mso-wrap-distance-left:9pt;mso-wrap-distance-top:0;mso-wrap-distance-right:9pt;mso-wrap-distance-bottom:0;mso-position-horizontal:absolute;mso-position-horizontal-relative:text;mso-position-vertical:absolute;mso-position-vertical-relative:text;v-text-anchor:middle" arcsize="10923f" o:gfxdata="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" fillcolor="#eaedf2 [351]" strokecolor="black [3213]" strokeweight="1pt">
+                <v:stroke joinstyle="miter"/>
+                <v:textbox>
+                  <w:txbxContent>
+                    <w:p>
+                      <w:pPr>
+                        <w:jc w:val="center"/>
+                        <w:rPr>
+                          <w:rFonts w:hAnsi="Calibri"/>
+                          <w:color w:val="000000" w:themeColor="text1"/>
+                          <w:kern w:val="24"/>
+                          <w:sz w:val="20"/>
+                          <w:szCs w:val="20"/>
+                          <w14:ligatures w14:val="none"/>
+                        </w:rPr>
+                      </w:pPr>
+                      <w:r>
+                        <w:rPr>
+                          <w:rFonts w:hAnsi="Calibri"/>
+                          <w:color w:val="000000" w:themeColor="text1"/>
+                          <w:kern w:val="24"/>
+                          <w:sz w:val="20"/>
+                          <w:szCs w:val="20"/>
+                        </w:rPr>
+                        <w:t>Coordonnées des balises dans repère caméra</w:t>
+                      </w:r>
+                    </w:p>
+                  </w:txbxContent>
+                </v:textbox>
+              </v:roundrect>
+            </w:pict>
+          </mc:Fallback>
+        </mc:AlternateContent>
+      </w:r>
+      <w:r>
+        <mc:AlternateContent>
+          <mc:Choice Requires="wps">
+            <w:drawing>
+              <wp:anchor distT="0" distB="0" distL="114300" distR="114300" simplePos="0" relativeHeight="251694080" behindDoc="0" locked="0" layoutInCell="1" allowOverlap="1" wp14:anchorId="0E08DD9A" wp14:editId="052A22A2">
+                <wp:simplePos x="0" y="0"/>
+                <wp:positionH relativeFrom="column">
+                  <wp:posOffset>104775</wp:posOffset>
+                </wp:positionH>
+                <wp:positionV relativeFrom="paragraph">
+                  <wp:posOffset>6350</wp:posOffset>
+                </wp:positionV>
+                <wp:extent cx="1687542" cy="222440"/>
+                <wp:effectExtent l="0" t="0" r="0" b="0"/>
+                <wp:wrapNone/>
+                <wp:docPr id="500323966" name="Rectangle : coins arrondis 20"/>
+                <wp:cNvGraphicFramePr xmlns:a="http://schemas.openxmlformats.org/drawingml/2006/main"/>
+                <a:graphic xmlns:a="http://schemas.openxmlformats.org/drawingml/2006/main">
+                  <a:graphicData uri="http://schemas.microsoft.com/office/word/2010/wordprocessingShape">
+                    <wps:wsp>
+                      <wps:cNvSpPr/>
+                      <wps:spPr>
+                        <a:xfrm>
+                          <a:off x="0" y="0"/>
+                          <a:ext cx="1687542" cy="222440"/>
+                        </a:xfrm>
+                        <a:prstGeom prst="roundRect">
+                          <a:avLst/>
+                        </a:prstGeom>
+                        <a:noFill/>
+                        <a:ln>
+                          <a:noFill/>
+                        </a:ln>
+                      </wps:spPr>
+                      <wps:style>
+                        <a:lnRef idx="2">
+                          <a:schemeClr val="accent1">
+                            <a:shade val="15000"/>
+                          </a:schemeClr>
+                        </a:lnRef>
+                        <a:fillRef idx="1">
+                          <a:schemeClr val="accent1"/>
+                        </a:fillRef>
+                        <a:effectRef idx="0">
+                          <a:schemeClr val="accent1"/>
+                        </a:effectRef>
+                        <a:fontRef idx="minor">
+                          <a:schemeClr val="lt1"/>
+                        </a:fontRef>
+                      </wps:style>
+                      <wps:txbx>
+                        <w:txbxContent>
+                          <w:p>
+                            <w:pPr>
+                              <w:jc w:val="center"/>
+                              <w:rPr>
+                                <w:rFonts w:hAnsi="Calibri"/>
+                                <w:b/>
+                                <w:bCs/>
+                                <w:color w:val="000000" w:themeColor="text1"/>
+                                <w:kern w:val="24"/>
+                                <w:sz w:val="20"/>
+                                <w:szCs w:val="20"/>
+                                <w14:ligatures w14:val="none"/>
+                              </w:rPr>
+                            </w:pPr>
+                            <w:r>
+                              <w:rPr>
+                                <w:rFonts w:hAnsi="Calibri"/>
+                                <w:b/>
+                                <w:bCs/>
+                                <w:color w:val="000000" w:themeColor="text1"/>
+                                <w:kern w:val="24"/>
+                                <w:sz w:val="20"/>
+                                <w:szCs w:val="20"/>
+                              </w:rPr>
+                              <w:t>ACTION</w:t>
+                            </w:r>
+                          </w:p>
+                        </w:txbxContent>
+                      </wps:txbx>
+                      <wps:bodyPr rtlCol="0" anchor="ctr"/>
+                    </wps:wsp>
+                  </a:graphicData>
+                </a:graphic>
+              </wp:anchor>
+            </w:drawing>
+          </mc:Choice>
+          <mc:Fallback>
+            <w:pict>
+              <v:roundrect w14:anchorId="0E08DD9A" id="Rectangle : coins arrondis 20" o:spid="_x0000_s1032" style="position:absolute;margin-left:8.25pt;margin-top:.5pt;width:132.9pt;height:17.5pt;z-index:251694080;visibility:visible;mso-wrap-style:square;mso-wrap-distance-left:9pt;mso-wrap-distance-top:0;mso-wrap-distance-right:9pt;mso-wrap-distance-bottom:0;mso-position-horizontal:absolute;mso-position-horizontal-relative:text;mso-position-vertical:absolute;mso-position-vertical-relative:text;v-text-anchor:middle" arcsize="10923f" o:gfxdata="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" filled="f" stroked="f" strokeweight="1pt">
+                <v:stroke joinstyle="miter"/>
+                <v:textbox>
+                  <w:txbxContent>
+                    <w:p>
+                      <w:pPr>
+                        <w:jc w:val="center"/>
+                        <w:rPr>
+                          <w:rFonts w:hAnsi="Calibri"/>
+                          <w:b/>
+                          <w:bCs/>
+                          <w:color w:val="000000" w:themeColor="text1"/>
+                          <w:kern w:val="24"/>
+                          <w:sz w:val="20"/>
+                          <w:szCs w:val="20"/>
+                          <w14:ligatures w14:val="none"/>
+                        </w:rPr>
+                      </w:pPr>
+                      <w:r>
+                        <w:rPr>
+                          <w:rFonts w:hAnsi="Calibri"/>
+                          <w:b/>
+                          <w:bCs/>
+                          <w:color w:val="000000" w:themeColor="text1"/>
+                          <w:kern w:val="24"/>
+                          <w:sz w:val="20"/>
+                          <w:szCs w:val="20"/>
+                        </w:rPr>
+                        <w:t>ACTION</w:t>
+                      </w:r>
+                    </w:p>
+                  </w:txbxContent>
+                </v:textbox>
+              </v:roundrect>
+            </w:pict>
+          </mc:Fallback>
+        </mc:AlternateContent>
+      </w:r>
+      <w:r>
+        <mc:AlternateContent>
+          <mc:Choice Requires="wps">
+            <w:drawing>
+              <wp:anchor distT="0" distB="0" distL="114300" distR="114300" simplePos="0" relativeHeight="251695104" behindDoc="0" locked="0" layoutInCell="1" allowOverlap="1" wp14:anchorId="3C7F517B" wp14:editId="7B65B119">
+                <wp:simplePos x="0" y="0"/>
+                <wp:positionH relativeFrom="column">
+                  <wp:posOffset>2874010</wp:posOffset>
+                </wp:positionH>
+                <wp:positionV relativeFrom="paragraph">
+                  <wp:posOffset>-635</wp:posOffset>
+                </wp:positionV>
+                <wp:extent cx="1687542" cy="222440"/>
+                <wp:effectExtent l="0" t="0" r="0" b="0"/>
+                <wp:wrapNone/>
+                <wp:docPr id="425656968" name="Rectangle : coins arrondis 21"/>
+                <wp:cNvGraphicFramePr xmlns:a="http://schemas.openxmlformats.org/drawingml/2006/main"/>
+                <a:graphic xmlns:a="http://schemas.openxmlformats.org/drawingml/2006/main">
+                  <a:graphicData uri="http://schemas.microsoft.com/office/word/2010/wordprocessingShape">
+                    <wps:wsp>
+                      <wps:cNvSpPr/>
+                      <wps:spPr>
+                        <a:xfrm>
+                          <a:off x="0" y="0"/>
+                          <a:ext cx="1687542" cy="222440"/>
+                        </a:xfrm>
+                        <a:prstGeom prst="roundRect">
+                          <a:avLst/>
+                        </a:prstGeom>
+                        <a:noFill/>
+                        <a:ln>
+                          <a:noFill/>
+                        </a:ln>
+                      </wps:spPr>
+                      <wps:style>
+                        <a:lnRef idx="2">
+                          <a:schemeClr val="accent1">
+                            <a:shade val="15000"/>
+                          </a:schemeClr>
+                        </a:lnRef>
+                        <a:fillRef idx="1">
+                          <a:schemeClr val="accent1"/>
+                        </a:fillRef>
+                        <a:effectRef idx="0">
+                          <a:schemeClr val="accent1"/>
+                        </a:effectRef>
+                        <a:fontRef idx="minor">
+                          <a:schemeClr val="lt1"/>
+                        </a:fontRef>
+                      </wps:style>
+                      <wps:txbx>
+                        <w:txbxContent>
+                          <w:p>
+                            <w:pPr>
+                              <w:jc w:val="center"/>
+                              <w:rPr>
+                                <w:rFonts w:hAnsi="Calibri"/>
+                                <w:b/>
+                                <w:bCs/>
+                                <w:color w:val="000000" w:themeColor="text1"/>
+                                <w:kern w:val="24"/>
+                                <w:sz w:val="20"/>
+                                <w:szCs w:val="20"/>
+                                <w14:ligatures w14:val="none"/>
+                              </w:rPr>
+                            </w:pPr>
+                            <w:r>
+                              <w:rPr>
+                                <w:rFonts w:hAnsi="Calibri"/>
+                                <w:b/>
+                                <w:bCs/>
+                                <w:color w:val="000000" w:themeColor="text1"/>
+                                <w:kern w:val="24"/>
+                                <w:sz w:val="20"/>
+                                <w:szCs w:val="20"/>
+                              </w:rPr>
+                              <w:t>ARTEFACT</w:t>
+                            </w:r>
+                          </w:p>
+                        </w:txbxContent>
+                      </wps:txbx>
+                      <wps:bodyPr rtlCol="0" anchor="ctr"/>
+                    </wps:wsp>
+                  </a:graphicData>
+                </a:graphic>
+              </wp:anchor>
+            </w:drawing>
+          </mc:Choice>
+          <mc:Fallback>
+            <w:pict>
+              <v:roundrect w14:anchorId="3C7F517B" id="Rectangle : coins arrondis 21" o:spid="_x0000_s1033" style="position:absolute;margin-left:226.3pt;margin-top:-.05pt;width:132.9pt;height:17.5pt;z-index:251695104;visibility:visible;mso-wrap-style:square;mso-wrap-distance-left:9pt;mso-wrap-distance-top:0;mso-wrap-distance-right:9pt;mso-wrap-distance-bottom:0;mso-position-horizontal:absolute;mso-position-horizontal-relative:text;mso-position-vertical:absolute;mso-position-vertical-relative:text;v-text-anchor:middle" arcsize="10923f" o:gfxdata="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" filled="f" stroked="f" strokeweight="1pt">
+                <v:stroke joinstyle="miter"/>
+                <v:textbox>
+                  <w:txbxContent>
+                    <w:p>
+                      <w:pPr>
+                        <w:jc w:val="center"/>
+                        <w:rPr>
+                          <w:rFonts w:hAnsi="Calibri"/>
+                          <w:b/>
+                          <w:bCs/>
+                          <w:color w:val="000000" w:themeColor="text1"/>
+                          <w:kern w:val="24"/>
+                          <w:sz w:val="20"/>
+                          <w:szCs w:val="20"/>
+                          <w14:ligatures w14:val="none"/>
+                        </w:rPr>
+                      </w:pPr>
+                      <w:r>
+                        <w:rPr>
+                          <w:rFonts w:hAnsi="Calibri"/>
+                          <w:b/>
+                          <w:bCs/>
+                          <w:color w:val="000000" w:themeColor="text1"/>
+                          <w:kern w:val="24"/>
+                          <w:sz w:val="20"/>
+                          <w:szCs w:val="20"/>
+                        </w:rPr>
+                        <w:t>ARTEFACT</w:t>
+                      </w:r>
+                    </w:p>
+                  </w:txbxContent>
+                </v:textbox>
+              </v:roundrect>
+            </w:pict>
+          </mc:Fallback>
+        </mc:AlternateContent>
+      </w:r>
+      <w:r>
+        <mc:AlternateContent>
+          <mc:Choice Requires="wps">
+            <w:drawing>
+              <wp:anchor distT="0" distB="0" distL="114300" distR="114300" simplePos="0" relativeHeight="251696128" behindDoc="0" locked="0" layoutInCell="1" allowOverlap="1" wp14:anchorId="07480EFC" wp14:editId="7273999C">
+                <wp:simplePos x="0" y="0"/>
+                <wp:positionH relativeFrom="column">
+                  <wp:posOffset>1897380</wp:posOffset>
+                </wp:positionH>
+                <wp:positionV relativeFrom="paragraph">
+                  <wp:posOffset>814705</wp:posOffset>
+                </wp:positionV>
+                <wp:extent cx="876268" cy="0"/>
+                <wp:effectExtent l="0" t="76200" r="19685" b="95250"/>
+                <wp:wrapNone/>
+                <wp:docPr id="1583166961" name="Connecteur droit avec flèche 22"/>
+                <wp:cNvGraphicFramePr xmlns:a="http://schemas.openxmlformats.org/drawingml/2006/main">
+                  <a:graphicFrameLocks xmlns:a="http://schemas.openxmlformats.org/drawingml/2006/main"/>
+                </wp:cNvGraphicFramePr>
+                <a:graphic xmlns:a="http://schemas.openxmlformats.org/drawingml/2006/main">
+                  <a:graphicData uri="http://schemas.microsoft.com/office/word/2010/wordprocessingShape">
+                    <wps:wsp>
+                      <wps:cNvCnPr>
+                        <a:cxnSpLocks/>
+                      </wps:cNvCnPr>
+                      <wps:spPr>
+                        <a:xfrm>
+                          <a:off x="0" y="0"/>
+                          <a:ext cx="876268" cy="0"/>
+                        </a:xfrm>
+                        <a:prstGeom prst="straightConnector1">
+                          <a:avLst/>
+                        </a:prstGeom>
+                        <a:ln>
+                          <a:solidFill>
+                            <a:schemeClr val="tx1"/>
+                          </a:solidFill>
+                          <a:tailEnd type="triangle"/>
+                        </a:ln>
+                      </wps:spPr>
+                      <wps:style>
+                        <a:lnRef idx="2">
+                          <a:schemeClr val="accent1"/>
+                        </a:lnRef>
+                        <a:fillRef idx="0">
+                          <a:schemeClr val="accent1"/>
+                        </a:fillRef>
+                        <a:effectRef idx="1">
+                          <a:schemeClr val="accent1"/>
+                        </a:effectRef>
+                        <a:fontRef idx="minor">
+                          <a:schemeClr val="tx1"/>
+                        </a:fontRef>
+                      </wps:style>
+                      <wps:bodyPr/>
+                    </wps:wsp>
+                  </a:graphicData>
+                </a:graphic>
+              </wp:anchor>
+            </w:drawing>
+          </mc:Choice>
+          <mc:Fallback>
+            <w:pict>
+              <v:shape w14:anchorId="08A3B241" id="Connecteur droit avec flèche 22" o:spid="_x0000_s1026" type="#_x0000_t32" style="position:absolute;margin-left:149.4pt;margin-top:64.15pt;width:69pt;height:0;z-index:251696128;visibility:visible;mso-wrap-style:square;mso-wrap-distance-left:9pt;mso-wrap-distance-top:0;mso-wrap-distance-right:9pt;mso-wrap-distance-bottom:0;mso-position-horizontal:absolute;mso-position-horizontal-relative:text;mso-position-vertical:absolute;mso-position-vertical-relative:text" o:gfxdata="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" strokecolor="black [3213]" strokeweight="1pt">
+                <v:stroke endarrow="block" joinstyle="miter"/>
+                <o:lock v:ext="edit" shapetype="f"/>
+              </v:shape>
+            </w:pict>
+          </mc:Fallback>
+        </mc:AlternateContent>
+      </w:r>
+      <w:r>
+        <mc:AlternateContent>
+          <mc:Choice Requires="wps">
+            <w:drawing>
+              <wp:anchor distT="0" distB="0" distL="114300" distR="114300" simplePos="0" relativeHeight="251697152" behindDoc="0" locked="0" layoutInCell="1" allowOverlap="1" wp14:anchorId="57D8DB20" wp14:editId="355B325E">
+                <wp:simplePos x="0" y="0"/>
+                <wp:positionH relativeFrom="column">
+                  <wp:posOffset>1897380</wp:posOffset>
+                </wp:positionH>
+                <wp:positionV relativeFrom="paragraph">
+                  <wp:posOffset>1576705</wp:posOffset>
+                </wp:positionV>
+                <wp:extent cx="876268" cy="21270"/>
+                <wp:effectExtent l="0" t="57150" r="38735" b="93345"/>
+                <wp:wrapNone/>
+                <wp:docPr id="1443726880" name="Connecteur droit avec flèche 26"/>
+                <wp:cNvGraphicFramePr xmlns:a="http://schemas.openxmlformats.org/drawingml/2006/main">
+                  <a:graphicFrameLocks xmlns:a="http://schemas.openxmlformats.org/drawingml/2006/main"/>
+                </wp:cNvGraphicFramePr>
+                <a:graphic xmlns:a="http://schemas.openxmlformats.org/drawingml/2006/main">
+                  <a:graphicData uri="http://schemas.microsoft.com/office/word/2010/wordprocessingShape">
+                    <wps:wsp>
+                      <wps:cNvCnPr>
+                        <a:cxnSpLocks/>
+                      </wps:cNvCnPr>
+                      <wps:spPr>
+                        <a:xfrm>
+                          <a:off x="0" y="0"/>
+                          <a:ext cx="876268" cy="21270"/>
+                        </a:xfrm>
+                        <a:prstGeom prst="straightConnector1">
+                          <a:avLst/>
+                        </a:prstGeom>
+                        <a:ln>
+                          <a:solidFill>
+                            <a:schemeClr val="tx1"/>
+                          </a:solidFill>
+                          <a:tailEnd type="triangle"/>
+                        </a:ln>
+                      </wps:spPr>
+                      <wps:style>
+                        <a:lnRef idx="2">
+                          <a:schemeClr val="accent1"/>
+                        </a:lnRef>
+                        <a:fillRef idx="0">
+                          <a:schemeClr val="accent1"/>
+                        </a:fillRef>
+                        <a:effectRef idx="1">
+                          <a:schemeClr val="accent1"/>
+                        </a:effectRef>
+                        <a:fontRef idx="minor">
+                          <a:schemeClr val="tx1"/>
+                        </a:fontRef>
+                      </wps:style>
+                      <wps:bodyPr/>
+                    </wps:wsp>
+                  </a:graphicData>
+                </a:graphic>
+              </wp:anchor>
+            </w:drawing>
+          </mc:Choice>
+          <mc:Fallback>
+            <w:pict>
+              <v:shape w14:anchorId="0888341C" id="Connecteur droit avec flèche 26" o:spid="_x0000_s1026" type="#_x0000_t32" style="position:absolute;margin-left:149.4pt;margin-top:124.15pt;width:69pt;height:1.65pt;z-index:251697152;visibility:visible;mso-wrap-style:square;mso-wrap-distance-left:9pt;mso-wrap-distance-top:0;mso-wrap-distance-right:9pt;mso-wrap-distance-bottom:0;mso-position-horizontal:absolute;mso-position-horizontal-relative:text;mso-position-vertical:absolute;mso-position-vertical-relative:text" o:gfxdata="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" strokecolor="black [3213]" strokeweight="1pt">
+                <v:stroke endarrow="block" joinstyle="miter"/>
+                <o:lock v:ext="edit" shapetype="f"/>
+              </v:shape>
+            </w:pict>
+          </mc:Fallback>
+        </mc:AlternateContent>
+      </w:r>
+      <w:r>
+        <mc:AlternateContent>
+          <mc:Choice Requires="wps">
+            <w:drawing>
+              <wp:anchor distT="0" distB="0" distL="114300" distR="114300" simplePos="0" relativeHeight="251698176" behindDoc="0" locked="0" layoutInCell="1" allowOverlap="1" wp14:anchorId="06A80E87" wp14:editId="7842045E">
+                <wp:simplePos x="0" y="0"/>
+                <wp:positionH relativeFrom="column">
+                  <wp:posOffset>2773680</wp:posOffset>
+                </wp:positionH>
+                <wp:positionV relativeFrom="paragraph">
+                  <wp:posOffset>1264285</wp:posOffset>
+                </wp:positionV>
+                <wp:extent cx="1687542" cy="552819"/>
+                <wp:effectExtent l="0" t="0" r="27305" b="19050"/>
+                <wp:wrapNone/>
+                <wp:docPr id="1399670396" name="Rectangle : coins arrondis 29"/>
+                <wp:cNvGraphicFramePr xmlns:a="http://schemas.openxmlformats.org/drawingml/2006/main"/>
+                <a:graphic xmlns:a="http://schemas.openxmlformats.org/drawingml/2006/main">
+                  <a:graphicData uri="http://schemas.microsoft.com/office/word/2010/wordprocessingShape">
+                    <wps:wsp>
+                      <wps:cNvSpPr/>
+                      <wps:spPr>
+                        <a:xfrm>
+                          <a:off x="0" y="0"/>
+                          <a:ext cx="1687542" cy="552819"/>
+                        </a:xfrm>
+                        <a:prstGeom prst="roundRect">
+                          <a:avLst/>
+                        </a:prstGeom>
+                        <a:solidFill>
+                          <a:schemeClr val="tx2">
+                            <a:lumMod val="10000"/>
+                            <a:lumOff val="90000"/>
+                          </a:schemeClr>
+                        </a:solidFill>
+                        <a:ln>
+                          <a:solidFill>
+                            <a:schemeClr val="tx1"/>
+                          </a:solidFill>
+                        </a:ln>
+                      </wps:spPr>
+                      <wps:style>
+                        <a:lnRef idx="2">
+                          <a:schemeClr val="accent1">
+                            <a:shade val="15000"/>
+                          </a:schemeClr>
+                        </a:lnRef>
+                        <a:fillRef idx="1">
+                          <a:schemeClr val="accent1"/>
+                        </a:fillRef>
+                        <a:effectRef idx="0">
+                          <a:schemeClr val="accent1"/>
+                        </a:effectRef>
+                        <a:fontRef idx="minor">
+                          <a:schemeClr val="lt1"/>
+                        </a:fontRef>
+                      </wps:style>
+                      <wps:txbx>
+                        <w:txbxContent>
+                          <w:p>
+                            <w:pPr>
+                              <w:jc w:val="center"/>
+                              <w:rPr>
+                                <w:rFonts w:hAnsi="Calibri"/>
+                                <w:color w:val="000000" w:themeColor="text1"/>
+                                <w:kern w:val="24"/>
+                                <w:sz w:val="20"/>
+                                <w:szCs w:val="20"/>
+                                <w14:ligatures w14:val="none"/>
+                              </w:rPr>
+                            </w:pPr>
+                            <w:r>
+                              <w:rPr>
+                                <w:rFonts w:hAnsi="Calibri"/>
+                                <w:color w:val="000000" w:themeColor="text1"/>
+                                <w:kern w:val="24"/>
+                                <w:sz w:val="20"/>
+                                <w:szCs w:val="20"/>
+                              </w:rPr>
+                              <w:t>Coordonnées des balises dans repère caméra</w:t>
+                            </w:r>
+                          </w:p>
+                        </w:txbxContent>
+                      </wps:txbx>
+                      <wps:bodyPr rtlCol="0" anchor="ctr"/>
+                    </wps:wsp>
+                  </a:graphicData>
+                </a:graphic>
+              </wp:anchor>
+            </w:drawing>
+          </mc:Choice>
+          <mc:Fallback>
+            <w:pict>
+              <v:roundrect w14:anchorId="06A80E87" id="Rectangle : coins arrondis 29" o:spid="_x0000_s1034" style="position:absolute;margin-left:218.4pt;margin-top:99.55pt;width:132.9pt;height:43.55pt;z-index:251698176;visibility:visible;mso-wrap-style:square;mso-wrap-distance-left:9pt;mso-wrap-distance-top:0;mso-wrap-distance-right:9pt;mso-wrap-distance-bottom:0;mso-position-horizontal:absolute;mso-position-horizontal-relative:text;mso-position-vertical:absolute;mso-position-vertical-relative:text;v-text-anchor:middle" arcsize="10923f" o:gfxdata="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" fillcolor="#eaedf2 [351]" strokecolor="black [3213]" strokeweight="1pt">
+                <v:stroke joinstyle="miter"/>
+                <v:textbox>
+                  <w:txbxContent>
+                    <w:p>
+                      <w:pPr>
+                        <w:jc w:val="center"/>
+                        <w:rPr>
+                          <w:rFonts w:hAnsi="Calibri"/>
+                          <w:color w:val="000000" w:themeColor="text1"/>
+                          <w:kern w:val="24"/>
+                          <w:sz w:val="20"/>
+                          <w:szCs w:val="20"/>
+                          <w14:ligatures w14:val="none"/>
+                        </w:rPr>
+                      </w:pPr>
+                      <w:r>
+                        <w:rPr>
+                          <w:rFonts w:hAnsi="Calibri"/>
+                          <w:color w:val="000000" w:themeColor="text1"/>
+                          <w:kern w:val="24"/>
+                          <w:sz w:val="20"/>
+                          <w:szCs w:val="20"/>
+                        </w:rPr>
+                        <w:t>Coordonnées des balises dans repère caméra</w:t>
+                      </w:r>
+                    </w:p>
+                  </w:txbxContent>
+                </v:textbox>
+              </v:roundrect>
+            </w:pict>
+          </mc:Fallback>
+        </mc:AlternateContent>
+      </w:r>
+      <w:r>
+        <mc:AlternateContent>
+          <mc:Choice Requires="wps">
+            <w:drawing>
+              <wp:anchor distT="0" distB="0" distL="114300" distR="114300" simplePos="0" relativeHeight="251699200" behindDoc="0" locked="0" layoutInCell="1" allowOverlap="1" wp14:anchorId="17AE7440" wp14:editId="1AAE7685">
+                <wp:simplePos x="0" y="0"/>
+                <wp:positionH relativeFrom="column">
+                  <wp:posOffset>2773680</wp:posOffset>
+                </wp:positionH>
+                <wp:positionV relativeFrom="paragraph">
+                  <wp:posOffset>2099310</wp:posOffset>
+                </wp:positionV>
+                <wp:extent cx="1687542" cy="552819"/>
+                <wp:effectExtent l="0" t="0" r="27305" b="19050"/>
+                <wp:wrapNone/>
+                <wp:docPr id="36" name="Rectangle : coins arrondis 35">
+                  <a:extLst xmlns:a="http://schemas.openxmlformats.org/drawingml/2006/main">
+                    <a:ext uri="{FF2B5EF4-FFF2-40B4-BE49-F238E27FC236}">
+                      <a16:creationId xmlns:a16="http://schemas.microsoft.com/office/drawing/2014/main" id="{900389BF-C232-380A-E2D7-7B535E27B484}"/>
+                    </a:ext>
+                  </a:extLst>
+                </wp:docPr>
+                <wp:cNvGraphicFramePr/>
+                <a:graphic xmlns:a="http://schemas.openxmlformats.org/drawingml/2006/main">
+                  <a:graphicData uri="http://schemas.microsoft.com/office/word/2010/wordprocessingShape">
+                    <wps:wsp>
+                      <wps:cNvSpPr/>
+                      <wps:spPr>
+                        <a:xfrm>
+                          <a:off x="0" y="0"/>
+                          <a:ext cx="1687542" cy="552819"/>
+                        </a:xfrm>
+                        <a:prstGeom prst="roundRect">
+                          <a:avLst/>
+                        </a:prstGeom>
+                        <a:solidFill>
+                          <a:schemeClr val="tx2">
+                            <a:lumMod val="10000"/>
+                            <a:lumOff val="90000"/>
+                          </a:schemeClr>
+                        </a:solidFill>
+                        <a:ln>
+                          <a:solidFill>
+                            <a:schemeClr val="tx1"/>
+                          </a:solidFill>
+                        </a:ln>
+                      </wps:spPr>
+                      <wps:style>
+                        <a:lnRef idx="2">
+                          <a:schemeClr val="accent1">
+                            <a:shade val="15000"/>
+                          </a:schemeClr>
+                        </a:lnRef>
+                        <a:fillRef idx="1">
+                          <a:schemeClr val="accent1"/>
+                        </a:fillRef>
+                        <a:effectRef idx="0">
+                          <a:schemeClr val="accent1"/>
+                        </a:effectRef>
+                        <a:fontRef idx="minor">
+                          <a:schemeClr val="lt1"/>
+                        </a:fontRef>
+                      </wps:style>
+                      <wps:txbx>
+                        <w:txbxContent>
+                          <w:p>
+                            <w:pPr>
+                              <w:jc w:val="center"/>
+                              <w:rPr>
+                                <w:rFonts w:hAnsi="Calibri"/>
+                                <w:color w:val="000000" w:themeColor="text1"/>
+                                <w:kern w:val="24"/>
+                                <w:sz w:val="20"/>
+                                <w:szCs w:val="20"/>
+                                <w14:ligatures w14:val="none"/>
+                              </w:rPr>
+                            </w:pPr>
+                            <w:r>
+                              <w:rPr>
+                                <w:rFonts w:hAnsi="Calibri"/>
+                                <w:color w:val="000000" w:themeColor="text1"/>
+                                <w:kern w:val="24"/>
+                                <w:sz w:val="20"/>
+                                <w:szCs w:val="20"/>
+                              </w:rPr>
+                              <w:t>Coordonnées des boites</w:t>
+                            </w:r>
+                          </w:p>
+                        </w:txbxContent>
+                      </wps:txbx>
+                      <wps:bodyPr rtlCol="0" anchor="ctr"/>
+                    </wps:wsp>
+                  </a:graphicData>
+                </a:graphic>
+              </wp:anchor>
+            </w:drawing>
+          </mc:Choice>
+          <mc:Fallback>
+            <w:pict>
+              <v:roundrect w14:anchorId="17AE7440" id="Rectangle : coins arrondis 35" o:spid="_x0000_s1035" style="position:absolute;margin-left:218.4pt;margin-top:165.3pt;width:132.9pt;height:43.55pt;z-index:251699200;visibility:visible;mso-wrap-style:square;mso-wrap-distance-left:9pt;mso-wrap-distance-top:0;mso-wrap-distance-right:9pt;mso-wrap-distance-bottom:0;mso-position-horizontal:absolute;mso-position-horizontal-relative:text;mso-position-vertical:absolute;mso-position-vertical-relative:text;v-text-anchor:middle" arcsize="10923f" o:gfxdata="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" fillcolor="#eaedf2 [351]" strokecolor="black [3213]" strokeweight="1pt">
+                <v:stroke joinstyle="miter"/>
+                <v:textbox>
+                  <w:txbxContent>
+                    <w:p>
+                      <w:pPr>
+                        <w:jc w:val="center"/>
+                        <w:rPr>
+                          <w:rFonts w:hAnsi="Calibri"/>
+                          <w:color w:val="000000" w:themeColor="text1"/>
+                          <w:kern w:val="24"/>
+                          <w:sz w:val="20"/>
+                          <w:szCs w:val="20"/>
+                          <w14:ligatures w14:val="none"/>
+                        </w:rPr>
+                      </w:pPr>
+                      <w:r>
+                        <w:rPr>
+                          <w:rFonts w:hAnsi="Calibri"/>
+                          <w:color w:val="000000" w:themeColor="text1"/>
+                          <w:kern w:val="24"/>
+                          <w:sz w:val="20"/>
+                          <w:szCs w:val="20"/>
+                        </w:rPr>
+                        <w:t>Coordonnées des boites</w:t>
+                      </w:r>
+                    </w:p>
+                  </w:txbxContent>
+                </v:textbox>
+              </v:roundrect>
+            </w:pict>
+          </mc:Fallback>
+        </mc:AlternateContent>
+      </w:r>
+      <w:r>
+        <mc:AlternateContent>
+          <mc:Choice Requires="wps">
+            <w:drawing>
+              <wp:anchor distT="0" distB="0" distL="114300" distR="114300" simplePos="0" relativeHeight="251700224" behindDoc="0" locked="0" layoutInCell="1" allowOverlap="1" wp14:anchorId="320599CB" wp14:editId="1BE9D38B">
+                <wp:simplePos x="0" y="0"/>
+                <wp:positionH relativeFrom="column">
+                  <wp:posOffset>1897380</wp:posOffset>
+                </wp:positionH>
+                <wp:positionV relativeFrom="paragraph">
+                  <wp:posOffset>2299970</wp:posOffset>
+                </wp:positionV>
+                <wp:extent cx="876268" cy="75721"/>
+                <wp:effectExtent l="0" t="0" r="76835" b="95885"/>
+                <wp:wrapNone/>
+                <wp:docPr id="37" name="Connecteur droit avec flèche 36">
+                  <a:extLst xmlns:a="http://schemas.openxmlformats.org/drawingml/2006/main">
+                    <a:ext uri="{FF2B5EF4-FFF2-40B4-BE49-F238E27FC236}">
+                      <a16:creationId xmlns:a16="http://schemas.microsoft.com/office/drawing/2014/main" id="{BF8D06EA-5466-2A77-793A-006A7E162920}"/>
+                    </a:ext>
+                  </a:extLst>
+                </wp:docPr>
+                <wp:cNvGraphicFramePr>
+                  <a:graphicFrameLocks xmlns:a="http://schemas.openxmlformats.org/drawingml/2006/main"/>
+                </wp:cNvGraphicFramePr>
+                <a:graphic xmlns:a="http://schemas.openxmlformats.org/drawingml/2006/main">
+                  <a:graphicData uri="http://schemas.microsoft.com/office/word/2010/wordprocessingShape">
+                    <wps:wsp>
+                      <wps:cNvCnPr>
+                        <a:cxnSpLocks/>
+                      </wps:cNvCnPr>
+                      <wps:spPr>
+                        <a:xfrm>
+                          <a:off x="0" y="0"/>
+                          <a:ext cx="876268" cy="75721"/>
+                        </a:xfrm>
+                        <a:prstGeom prst="straightConnector1">
+                          <a:avLst/>
+                        </a:prstGeom>
+                        <a:ln>
+                          <a:solidFill>
+                            <a:schemeClr val="tx1"/>
+                          </a:solidFill>
+                          <a:tailEnd type="triangle"/>
+                        </a:ln>
+                      </wps:spPr>
+                      <wps:style>
+                        <a:lnRef idx="2">
+                          <a:schemeClr val="accent1"/>
+                        </a:lnRef>
+                        <a:fillRef idx="0">
+                          <a:schemeClr val="accent1"/>
+                        </a:fillRef>
+                        <a:effectRef idx="1">
+                          <a:schemeClr val="accent1"/>
+                        </a:effectRef>
+                        <a:fontRef idx="minor">
+                          <a:schemeClr val="tx1"/>
+                        </a:fontRef>
+                      </wps:style>
+                      <wps:bodyPr/>
+                    </wps:wsp>
+                  </a:graphicData>
+                </a:graphic>
+              </wp:anchor>
+            </w:drawing>
+          </mc:Choice>
+          <mc:Fallback>
+            <w:pict>
+              <v:shape w14:anchorId="6FEFD559" id="Connecteur droit avec flèche 36" o:spid="_x0000_s1026" type="#_x0000_t32" style="position:absolute;margin-left:149.4pt;margin-top:181.1pt;width:69pt;height:5.95pt;z-index:251700224;visibility:visible;mso-wrap-style:square;mso-wrap-distance-left:9pt;mso-wrap-distance-top:0;mso-wrap-distance-right:9pt;mso-wrap-distance-bottom:0;mso-position-horizontal:absolute;mso-position-horizontal-relative:text;mso-position-vertical:absolute;mso-position-vertical-relative:text" o:gfxdata="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" strokecolor="black [3213]" strokeweight="1pt">
+                <v:stroke endarrow="block" joinstyle="miter"/>
+                <o:lock v:ext="edit" shapetype="f"/>
+              </v:shape>
+            </w:pict>
+          </mc:Fallback>
+        </mc:AlternateContent>
+      </w:r>
+    </w:p>
+    <w:p>
+      <w:pPr>
+        <w:spacing w:after="0"/>
+        <w:rPr>
+          <w:lang w:val="en-GB"/>
+        </w:rPr>
+      </w:pPr>
+    </w:p>
+    <w:p>
+      <w:pPr>
+        <w:spacing w:after="0"/>
+        <w:rPr>
+          <w:lang w:val="en-GB"/>
+        </w:rPr>
+      </w:pPr>
+    </w:p>
+    <w:p>
+      <w:pPr>
+        <w:spacing w:after="0"/>
+        <w:rPr>
+          <w:lang w:val="en-GB"/>
+        </w:rPr>
+      </w:pPr>
+    </w:p>
+    <w:p>
+      <w:pPr>
+        <w:spacing w:after="0"/>
+        <w:rPr>
+          <w:lang w:val="en-GB"/>
+        </w:rPr>
+      </w:pPr>
+    </w:p>
+    <w:p>
+      <w:pPr>
+        <w:spacing w:after="0"/>
+        <w:rPr>
+          <w:lang w:val="en-GB"/>
+        </w:rPr>
+      </w:pPr>
+    </w:p>
+    <w:p>
+      <w:pPr>
+        <w:spacing w:after="0"/>
+        <w:rPr>
+          <w:lang w:val="en-GB"/>
+        </w:rPr>
+      </w:pPr>
+    </w:p>
+    <w:p>
+      <w:pPr>
+        <w:spacing w:after="0"/>
+        <w:rPr>
+          <w:lang w:val="en-GB"/>
+        </w:rPr>
+      </w:pPr>
+    </w:p>
+    <w:p>
+      <w:pPr>
+        <w:spacing w:after="0"/>
+        <w:rPr>
+          <w:lang w:val="en-GB"/>
+        </w:rPr>
+      </w:pPr>
+    </w:p>
+    <w:p>
+      <w:pPr>
+        <w:spacing w:after="0"/>
+        <w:rPr>
+          <w:lang w:val="en-GB"/>
+        </w:rPr>
+      </w:pPr>
+    </w:p>
+    <w:p>
+      <w:pPr>
+        <w:spacing w:after="0"/>
+        <w:rPr>
+          <w:lang w:val="en-GB"/>
+        </w:rPr>
+      </w:pPr>
+    </w:p>
+    <w:p>
+      <w:pPr>
+        <w:spacing w:after="0"/>
+        <w:rPr>
+          <w:lang w:val="en-GB"/>
+        </w:rPr>
+      </w:pPr>
+    </w:p>
+    <w:p>
+      <w:pPr>
+        <w:spacing w:after="0"/>
+        <w:rPr>
+          <w:lang w:val="en-GB"/>
+        </w:rPr>
+      </w:pPr>
+    </w:p>
+    <w:p>
+      <w:pPr>
+        <w:spacing w:after="0"/>
+        <w:rPr>
+          <w:lang w:val="en-GB"/>
+        </w:rPr>
+      </w:pPr>
+    </w:p>
+    <w:p>
+      <w:pPr>
+        <w:spacing w:after="0"/>
+        <w:rPr>
+          <w:lang w:val="en-GB"/>
+        </w:rPr>
+      </w:pPr>
+    </w:p>
+    <w:p>
+      <w:pPr>
+        <w:spacing w:after="0"/>
+        <w:rPr>
+          <w:lang w:val="en-GB"/>
+        </w:rPr>
+      </w:pPr>
+    </w:p>
+    <w:p>
+      <w:pPr>
+        <w:spacing w:after="0"/>
+        <w:rPr>
+          <w:lang w:val="en-GB"/>
+        </w:rPr>
+      </w:pPr>
+    </w:p>
+    <w:p>
+      <w:pPr>
+        <w:spacing w:after="0"/>
+        <w:rPr>
+          <w:lang w:val="en-GB"/>
+        </w:rPr>
+      </w:pPr>
+    </w:p>
+    <w:p>
+      <w:pPr>
+        <w:spacing w:after="0"/>
+        <w:rPr>
+          <w:lang w:val="en-GB"/>
+        </w:rPr>
+      </w:pPr>
+    </w:p>
+    <w:p>
+      <w:pPr>
+        <w:spacing w:after="0"/>
+        <w:rPr>
+          <w:lang w:val="en-GB"/>
+        </w:rPr>
+      </w:pPr>
+    </w:p>
+    <w:p>
+      <w:pPr>
+        <w:spacing w:after="0"/>
+        <w:rPr>
+          <w:lang w:val="en-GB"/>
+        </w:rPr>
+      </w:pPr>
+    </w:p>
+    <w:p>
+      <w:pPr>
+        <w:spacing w:after="0"/>
+        <w:rPr>
+          <w:lang w:val="en-GB"/>
+        </w:rPr>
+      </w:pPr>
+    </w:p>
+    <w:p>
+      <w:pPr>
+        <w:spacing w:after="0"/>
+        <w:rPr>
+          <w:lang w:val="en-GB"/>
+        </w:rPr>
+      </w:pPr>
+    </w:p>
+    <w:p>
+      <w:pPr>
+        <w:spacing w:after="0"/>
+        <w:rPr>
+          <w:lang w:val="en-GB"/>
+        </w:rPr>
+      </w:pPr>
+    </w:p>
+    <w:p>
+      <w:pPr>
+        <w:spacing w:after="0"/>
+        <w:rPr>
+          <w:lang w:val="en-GB"/>
+        </w:rPr>
+      </w:pPr>
+    </w:p>
+    <w:p>
+      <w:pPr>
+        <w:spacing w:after="0"/>
+        <w:rPr>
+          <w:lang w:val="en-GB"/>
+        </w:rPr>
+      </w:pPr>
+    </w:p>
+    <w:p>
+      <w:pPr>
+        <w:spacing w:after="0"/>
+        <w:rPr>
+          <w:lang w:val="en-GB"/>
+        </w:rPr>
+      </w:pPr>
+    </w:p>
+    <w:p>
+      <w:pPr>
+        <w:spacing w:after="0"/>
+        <w:rPr>
+          <w:lang w:val="en-GB"/>
+        </w:rPr>
+      </w:pPr>
+    </w:p>
+    <w:p>
+      <w:pPr>
+        <w:spacing w:after="0"/>
+        <w:rPr>
+          <w:lang w:val="en-GB"/>
+        </w:rPr>
+      </w:pPr>
+    </w:p>
+    <w:p>
+      <w:pPr>
+        <w:spacing w:after="0"/>
+        <w:rPr>
+          <w:lang w:val="en-GB"/>
+        </w:rPr>
+      </w:pPr>
+    </w:p>
+    <w:p>
+      <w:pPr>
+        <w:spacing w:after="0"/>
+        <w:rPr>
+          <w:lang w:val="en-GB"/>
+        </w:rPr>
+      </w:pPr>
+    </w:p>
+    <w:p>
+      <w:pPr>
+        <w:spacing w:after="0"/>
+        <w:rPr>
+          <w:lang w:val="en-GB"/>
+        </w:rPr>
+      </w:pPr>
+    </w:p>
+    <w:p>
+      <w:pPr>
+        <w:spacing w:after="0"/>
+        <w:rPr>
+          <w:lang w:val="en-GB"/>
+        </w:rPr>
+      </w:pPr>
+    </w:p>
+    <w:p>
+      <w:pPr>
+        <w:spacing w:after="0"/>
+        <w:rPr>
+          <w:lang w:val="en-GB"/>
+        </w:rPr>
+      </w:pPr>
+    </w:p>
+    <w:p>
+      <w:pPr>
+        <w:spacing w:after="0"/>
+        <w:rPr>
+          <w:lang w:val="en-GB"/>
+        </w:rPr>
+      </w:pPr>
+    </w:p>
+    <w:p>
+      <w:pPr>
+        <w:spacing w:after="0"/>
+        <w:rPr>
+          <w:lang w:val="en-GB"/>
+        </w:rPr>
+      </w:pPr>
+    </w:p>
+    <w:p>
+      <w:pPr>
+        <w:spacing w:after="0"/>
+        <w:rPr>
+          <w:lang w:val="en-GB"/>
+        </w:rPr>
+      </w:pPr>
+    </w:p>
+    <w:p>
+      <w:pPr>
+        <w:spacing w:after="0"/>
+        <w:rPr>
+          <w:lang w:val="en-GB"/>
+        </w:rPr>
+      </w:pPr>
+      <w:r>
+        <w:drawing>
+          <wp:inline distT="0" distB="0" distL="0" distR="0" wp14:anchorId="43F5A190" wp14:editId="6BD3AF8D">
+            <wp:extent cx="6645910" cy="2774315"/>
+            <wp:effectExtent l="0" t="0" r="2540" b="6985"/>
+            <wp:docPr id="1158181050" name="Image 4" descr="Une image contenant capture d’écran, graphisme, conception&#10;&#10;Le contenu généré par l’IA peut être incorrect.">
+              <a:extLst xmlns:a="http://schemas.openxmlformats.org/drawingml/2006/main">
+                <a:ext uri="{FF2B5EF4-FFF2-40B4-BE49-F238E27FC236}">
+                  <a16:creationId xmlns:a16="http://schemas.microsoft.com/office/drawing/2014/main" id="{4073EDB1-FC63-AAFC-AAF5-4994B550F6E8}"/>
+                </a:ext>
+              </a:extLst>
+            </wp:docPr>
+            <wp:cNvGraphicFramePr>
+              <a:graphicFrameLocks xmlns:a="http://schemas.openxmlformats.org/drawingml/2006/main" noChangeAspect="1"/>
+            </wp:cNvGraphicFramePr>
+            <a:graphic xmlns:a="http://schemas.openxmlformats.org/drawingml/2006/main">
+              <a:graphicData uri="http://schemas.openxmlformats.org/drawingml/2006/picture">
+                <pic:pic xmlns:pic="http://schemas.openxmlformats.org/drawingml/2006/picture">
+                  <pic:nvPicPr>
+                    <pic:cNvPr id="1158181050" name="Image 4" descr="Une image contenant capture d’écran, graphisme, conception&#10;&#10;Le contenu généré par l’IA peut être incorrect.">
+                      <a:extLst>
+                        <a:ext uri="{FF2B5EF4-FFF2-40B4-BE49-F238E27FC236}">
+                          <a16:creationId xmlns:a16="http://schemas.microsoft.com/office/drawing/2014/main" id="{4073EDB1-FC63-AAFC-AAF5-4994B550F6E8}"/>
+                        </a:ext>
+                      </a:extLst>
+                    </pic:cNvPr>
+                    <pic:cNvPicPr>
+                      <a:picLocks noChangeAspect="1"/>
+                    </pic:cNvPicPr>
+                  </pic:nvPicPr>
+                  <pic:blipFill>
+                    <a:blip r:embed="rId9"/>
+                    <a:stretch>
+                      <a:fillRect/>
+                    </a:stretch>
+                  </pic:blipFill>
+                  <pic:spPr>
+                    <a:xfrm>
+                      <a:off x="0" y="0"/>
+                      <a:ext cx="6645910" cy="2774315"/>
+                    </a:xfrm>
+                    <a:prstGeom prst="rect">
+                      <a:avLst/>
+                    </a:prstGeom>
+                  </pic:spPr>
+                </pic:pic>
+              </a:graphicData>
+            </a:graphic>
+          </wp:inline>
+        </w:drawing>
+      </w:r>
+    </w:p>
+    <w:p>
+      <w:pPr>
+        <w:spacing w:after="0"/>
+        <w:rPr>
+          <w:lang w:val="en-GB"/>
+        </w:rPr>
+      </w:pPr>
+    </w:p>
+    <w:p>
+      <w:pPr>
+        <w:spacing w:after="0"/>
+        <w:rPr>
+          <w:lang w:val="en-GB"/>
+        </w:rPr>
+      </w:pPr>
+    </w:p>
+    <w:p>
+      <w:pPr>
+        <w:spacing w:after="0"/>
+        <w:rPr>
+          <w:lang w:val="en-GB"/>
+        </w:rPr>
+      </w:pPr>
+    </w:p>
+    <w:p>
+      <w:pPr>
+        <w:spacing w:after="0"/>
+        <w:rPr>
+          <w:lang w:val="en-GB"/>
+        </w:rPr>
+      </w:pPr>
+    </w:p>
+    <w:p>
+      <w:pPr>
+        <w:spacing w:after="0"/>
+        <w:rPr>
+          <w:lang w:val="en-GB"/>
+        </w:rPr>
+      </w:pPr>
+    </w:p>
+    <w:p>
+      <w:pPr>
+        <w:spacing w:after="0"/>
+        <w:rPr>
+          <w:lang w:val="en-GB"/>
+        </w:rPr>
+      </w:pPr>
+    </w:p>
+    <w:p>
+      <w:pPr>
+        <w:spacing w:after="0"/>
+        <w:rPr>
+          <w:lang w:val="en-GB"/>
+        </w:rPr>
+      </w:pPr>
+      <w:r>
+        <w:drawing>
+          <wp:anchor distT="0" distB="0" distL="114300" distR="114300" simplePos="0" relativeHeight="251659264" behindDoc="0" locked="0" layoutInCell="1" allowOverlap="1" wp14:anchorId="3A240F76" wp14:editId="052D60D6">
+            <wp:simplePos x="0" y="0"/>
+            <wp:positionH relativeFrom="column">
+              <wp:posOffset>457200</wp:posOffset>
+            </wp:positionH>
+            <wp:positionV relativeFrom="paragraph">
+              <wp:posOffset>457200</wp:posOffset>
+            </wp:positionV>
+            <wp:extent cx="1485900" cy="835819"/>
+            <wp:effectExtent l="0" t="0" r="0" b="2540"/>
+            <wp:wrapNone/>
+            <wp:docPr id="5" name="Image 4" descr="Une image contenant carte, texte, puzzle, intérieur&#10;&#10;Le contenu généré par l’IA peut être incorrect.">
+              <a:extLst xmlns:a="http://schemas.openxmlformats.org/drawingml/2006/main">
+                <a:ext uri="{FF2B5EF4-FFF2-40B4-BE49-F238E27FC236}">
+                  <a16:creationId xmlns:a16="http://schemas.microsoft.com/office/drawing/2014/main" id="{F3EBD849-406B-2E1B-64EC-72835EE29ADD}"/>
+                </a:ext>
+              </a:extLst>
+            </wp:docPr>
+            <wp:cNvGraphicFramePr>
+              <a:graphicFrameLocks xmlns:a="http://schemas.openxmlformats.org/drawingml/2006/main" noChangeAspect="1"/>
+            </wp:cNvGraphicFramePr>
+            <a:graphic xmlns:a="http://schemas.openxmlformats.org/drawingml/2006/main">
+              <a:graphicData uri="http://schemas.openxmlformats.org/drawingml/2006/picture">
+                <pic:pic xmlns:pic="http://schemas.openxmlformats.org/drawingml/2006/picture">
+                  <pic:nvPicPr>
+                    <pic:cNvPr id="5" name="Image 4" descr="Une image contenant carte, texte, puzzle, intérieur&#10;&#10;Le contenu généré par l’IA peut être incorrect.">
+                      <a:extLst>
+                        <a:ext uri="{FF2B5EF4-FFF2-40B4-BE49-F238E27FC236}">
+                          <a16:creationId xmlns:a16="http://schemas.microsoft.com/office/drawing/2014/main" id="{F3EBD849-406B-2E1B-64EC-72835EE29ADD}"/>
+                        </a:ext>
+                      </a:extLst>
+                    </pic:cNvPr>
+                    <pic:cNvPicPr>
+                      <a:picLocks noChangeAspect="1"/>
+                    </pic:cNvPicPr>
+                  </pic:nvPicPr>
+                  <pic:blipFill>
+                    <a:blip r:embed="rId10" cstate="print">
+                      <a:extLst>
+                        <a:ext uri="{28A0092B-C50C-407E-A947-70E740481C1C}">
+                          <a14:useLocalDpi xmlns:a14="http://schemas.microsoft.com/office/drawing/2010/main" val="0"/>
+                        </a:ext>
+                      </a:extLst>
+                    </a:blip>
+                    <a:stretch>
+                      <a:fillRect/>
+                    </a:stretch>
+                  </pic:blipFill>
+                  <pic:spPr>
+                    <a:xfrm>
+                      <a:off x="0" y="0"/>
+                      <a:ext cx="1485900" cy="835819"/>
+                    </a:xfrm>
+                    <a:prstGeom prst="rect">
+                      <a:avLst/>
+                    </a:prstGeom>
+                  </pic:spPr>
+                </pic:pic>
+              </a:graphicData>
+            </a:graphic>
+          </wp:anchor>
+        </w:drawing>
+      </w:r>
+      <w:r>
+        <mc:AlternateContent>
+          <mc:Choice Requires="wps">
+            <w:drawing>
+              <wp:anchor distT="0" distB="0" distL="114300" distR="114300" simplePos="0" relativeHeight="251660288" behindDoc="0" locked="0" layoutInCell="1" allowOverlap="1" wp14:anchorId="71E97669" wp14:editId="24707D94">
+                <wp:simplePos x="0" y="0"/>
+                <wp:positionH relativeFrom="column">
+                  <wp:posOffset>457200</wp:posOffset>
+                </wp:positionH>
+                <wp:positionV relativeFrom="paragraph">
+                  <wp:posOffset>1409700</wp:posOffset>
+                </wp:positionV>
+                <wp:extent cx="1485900" cy="246221"/>
+                <wp:effectExtent l="0" t="0" r="0" b="0"/>
+                <wp:wrapNone/>
+                <wp:docPr id="6" name="ZoneTexte 5">
+                  <a:extLst xmlns:a="http://schemas.openxmlformats.org/drawingml/2006/main">
+                    <a:ext uri="{FF2B5EF4-FFF2-40B4-BE49-F238E27FC236}">
+                      <a16:creationId xmlns:a16="http://schemas.microsoft.com/office/drawing/2014/main" id="{96CEF6D4-0C86-CF0F-B5DC-2C9F6D997919}"/>
+                    </a:ext>
+                  </a:extLst>
+                </wp:docPr>
+                <wp:cNvGraphicFramePr/>
+                <a:graphic xmlns:a="http://schemas.openxmlformats.org/drawingml/2006/main">
+                  <a:graphicData uri="http://schemas.microsoft.com/office/word/2010/wordprocessingShape">
+                    <wps:wsp>
+                      <wps:cNvSpPr txBox="1"/>
+                      <wps:spPr>
+                        <a:xfrm>
+                          <a:off x="0" y="0"/>
+                          <a:ext cx="1485900" cy="246221"/>
+                        </a:xfrm>
+                        <a:prstGeom prst="rect">
+                          <a:avLst/>
+                        </a:prstGeom>
+                        <a:noFill/>
+                      </wps:spPr>
+                      <wps:txbx>
+                        <w:txbxContent>
+                          <w:p>
+                            <w:pPr>
+                              <w:jc w:val="center"/>
+                              <w:rPr>
+                                <w:rFonts w:hAnsi="Calibri"/>
+                                <w:color w:val="000000" w:themeColor="text1"/>
+                                <w:kern w:val="24"/>
+                                <w:sz w:val="20"/>
+                                <w:szCs w:val="20"/>
+                                <w14:ligatures w14:val="none"/>
+                              </w:rPr>
+                            </w:pPr>
+                            <w:r>
+                              <w:rPr>
+                                <w:rFonts w:hAnsi="Calibri"/>
+                                <w:color w:val="000000" w:themeColor="text1"/>
+                                <w:kern w:val="24"/>
+                                <w:sz w:val="20"/>
+                                <w:szCs w:val="20"/>
+                              </w:rPr>
+                              <w:t>Image de base</w:t>
+                            </w:r>
+                          </w:p>
+                        </w:txbxContent>
+                      </wps:txbx>
+                      <wps:bodyPr wrap="square" rtlCol="0">
+                        <a:spAutoFit/>
+                      </wps:bodyPr>
+                    </wps:wsp>
+                  </a:graphicData>
+                </a:graphic>
+              </wp:anchor>
+            </w:drawing>
+          </mc:Choice>
+          <mc:Fallback>
+            <w:pict>
+              <v:shapetype w14:anchorId="71E97669" id="_x0000_t202" coordsize="21600,21600" o:spt="202" path="m,l,21600r21600,l21600,xe">
+                <v:stroke joinstyle="miter"/>
+                <v:path gradientshapeok="t" o:connecttype="rect"/>
+              </v:shapetype>
+              <v:shape id="ZoneTexte 5" o:spid="_x0000_s1036" type="#_x0000_t202" style="position:absolute;margin-left:36pt;margin-top:111pt;width:117pt;height:19.4pt;z-index:251660288;visibility:visible;mso-wrap-style:square;mso-wrap-distance-left:9pt;mso-wrap-distance-top:0;mso-wrap-distance-right:9pt;mso-wrap-distance-bottom:0;mso-position-horizontal:absolute;mso-position-horizontal-relative:text;mso-position-vertical:absolute;mso-position-vertical-relative:text;v-text-anchor:top" o:gfxdata="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" filled="f" stroked="f">
+                <v:textbox style="mso-fit-shape-to-text:t">
+                  <w:txbxContent>
+                    <w:p>
+                      <w:pPr>
+                        <w:jc w:val="center"/>
+                        <w:rPr>
+                          <w:rFonts w:hAnsi="Calibri"/>
+                          <w:color w:val="000000" w:themeColor="text1"/>
+                          <w:kern w:val="24"/>
+                          <w:sz w:val="20"/>
+                          <w:szCs w:val="20"/>
+                          <w14:ligatures w14:val="none"/>
+                        </w:rPr>
+                      </w:pPr>
+                      <w:r>
+                        <w:rPr>
+                          <w:rFonts w:hAnsi="Calibri"/>
+                          <w:color w:val="000000" w:themeColor="text1"/>
+                          <w:kern w:val="24"/>
+                          <w:sz w:val="20"/>
+                          <w:szCs w:val="20"/>
+                        </w:rPr>
+                        <w:t>Image de base</w:t>
+                      </w:r>
+                    </w:p>
+                  </w:txbxContent>
+                </v:textbox>
+              </v:shape>
+            </w:pict>
+          </mc:Fallback>
+        </mc:AlternateContent>
+      </w:r>
+      <w:r>
+        <mc:AlternateContent>
+          <mc:Choice Requires="wps">
+            <w:drawing>
+              <wp:anchor distT="0" distB="0" distL="114300" distR="114300" simplePos="0" relativeHeight="251661312" behindDoc="0" locked="0" layoutInCell="1" allowOverlap="1" wp14:anchorId="0A8E4BBE" wp14:editId="0FFC7B9D">
+                <wp:simplePos x="0" y="0"/>
+                <wp:positionH relativeFrom="column">
+                  <wp:posOffset>2152650</wp:posOffset>
+                </wp:positionH>
+                <wp:positionV relativeFrom="paragraph">
+                  <wp:posOffset>1066800</wp:posOffset>
+                </wp:positionV>
+                <wp:extent cx="508000" cy="0"/>
+                <wp:effectExtent l="0" t="76200" r="25400" b="95250"/>
+                <wp:wrapNone/>
+                <wp:docPr id="8" name="Connecteur droit avec flèche 7">
+                  <a:extLst xmlns:a="http://schemas.openxmlformats.org/drawingml/2006/main">
+                    <a:ext uri="{FF2B5EF4-FFF2-40B4-BE49-F238E27FC236}">
+                      <a16:creationId xmlns:a16="http://schemas.microsoft.com/office/drawing/2014/main" id="{54B49978-5553-8DE3-296B-3E85FB87ECAB}"/>
+                    </a:ext>
+                  </a:extLst>
+                </wp:docPr>
+                <wp:cNvGraphicFramePr/>
+                <a:graphic xmlns:a="http://schemas.openxmlformats.org/drawingml/2006/main">
+                  <a:graphicData uri="http://schemas.microsoft.com/office/word/2010/wordprocessingShape">
+                    <wps:wsp>
+                      <wps:cNvCnPr/>
+                      <wps:spPr>
+                        <a:xfrm>
+                          <a:off x="0" y="0"/>
+                          <a:ext cx="508000" cy="0"/>
+                        </a:xfrm>
+                        <a:prstGeom prst="straightConnector1">
+                          <a:avLst/>
+                        </a:prstGeom>
+                        <a:ln>
+                          <a:solidFill>
+                            <a:schemeClr val="tx1"/>
+                          </a:solidFill>
+                          <a:tailEnd type="triangle"/>
+                        </a:ln>
+                      </wps:spPr>
+                      <wps:style>
+                        <a:lnRef idx="2">
+                          <a:schemeClr val="accent1"/>
+                        </a:lnRef>
+                        <a:fillRef idx="0">
+                          <a:schemeClr val="accent1"/>
+                        </a:fillRef>
+                        <a:effectRef idx="1">
+                          <a:schemeClr val="accent1"/>
+                        </a:effectRef>
+                        <a:fontRef idx="minor">
+                          <a:schemeClr val="tx1"/>
+                        </a:fontRef>
+                      </wps:style>
+                      <wps:bodyPr/>
+                    </wps:wsp>
+                  </a:graphicData>
+                </a:graphic>
+              </wp:anchor>
+            </w:drawing>
+          </mc:Choice>
+          <mc:Fallback>
+            <w:pict>
+              <v:shape w14:anchorId="3886650A" id="Connecteur droit avec flèche 7" o:spid="_x0000_s1026" type="#_x0000_t32" style="position:absolute;margin-left:169.5pt;margin-top:84pt;width:40pt;height:0;z-index:251661312;visibility:visible;mso-wrap-style:square;mso-wrap-distance-left:9pt;mso-wrap-distance-top:0;mso-wrap-distance-right:9pt;mso-wrap-distance-bottom:0;mso-position-horizontal:absolute;mso-position-horizontal-relative:text;mso-position-vertical:absolute;mso-position-vertical-relative:text" o:gfxdata="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" strokecolor="black [3213]" strokeweight="1pt">
+                <v:stroke endarrow="block" joinstyle="miter"/>
+              </v:shape>
+            </w:pict>
+          </mc:Fallback>
+        </mc:AlternateContent>
+      </w:r>
+      <w:r>
+        <w:drawing>
+          <wp:anchor distT="0" distB="0" distL="114300" distR="114300" simplePos="0" relativeHeight="251662336" behindDoc="0" locked="0" layoutInCell="1" allowOverlap="1" wp14:anchorId="641EE35D" wp14:editId="318B1945">
+            <wp:simplePos x="0" y="0"/>
+            <wp:positionH relativeFrom="column">
+              <wp:posOffset>2857500</wp:posOffset>
+            </wp:positionH>
+            <wp:positionV relativeFrom="paragraph">
+              <wp:posOffset>457200</wp:posOffset>
+            </wp:positionV>
+            <wp:extent cx="1485900" cy="844504"/>
+            <wp:effectExtent l="0" t="0" r="0" b="0"/>
+            <wp:wrapNone/>
+            <wp:docPr id="12" name="Image 11" descr="Une image contenant capture d’écran, obscurité, noir&#10;&#10;Le contenu généré par l’IA peut être incorrect.">
+              <a:extLst xmlns:a="http://schemas.openxmlformats.org/drawingml/2006/main">
+                <a:ext uri="{FF2B5EF4-FFF2-40B4-BE49-F238E27FC236}">
+                  <a16:creationId xmlns:a16="http://schemas.microsoft.com/office/drawing/2014/main" id="{BC670DC8-A4CF-D1F0-7A5A-C970B2B24EAD}"/>
+                </a:ext>
+              </a:extLst>
+            </wp:docPr>
+            <wp:cNvGraphicFramePr>
+              <a:graphicFrameLocks xmlns:a="http://schemas.openxmlformats.org/drawingml/2006/main" noChangeAspect="1"/>
+            </wp:cNvGraphicFramePr>
+            <a:graphic xmlns:a="http://schemas.openxmlformats.org/drawingml/2006/main">
+              <a:graphicData uri="http://schemas.openxmlformats.org/drawingml/2006/picture">
+                <pic:pic xmlns:pic="http://schemas.openxmlformats.org/drawingml/2006/picture">
+                  <pic:nvPicPr>
+                    <pic:cNvPr id="12" name="Image 11" descr="Une image contenant capture d’écran, obscurité, noir&#10;&#10;Le contenu généré par l’IA peut être incorrect.">
+                      <a:extLst>
+                        <a:ext uri="{FF2B5EF4-FFF2-40B4-BE49-F238E27FC236}">
+                          <a16:creationId xmlns:a16="http://schemas.microsoft.com/office/drawing/2014/main" id="{BC670DC8-A4CF-D1F0-7A5A-C970B2B24EAD}"/>
+                        </a:ext>
+                      </a:extLst>
+                    </pic:cNvPr>
+                    <pic:cNvPicPr>
+                      <a:picLocks noChangeAspect="1"/>
+                    </pic:cNvPicPr>
+                  </pic:nvPicPr>
+                  <pic:blipFill>
+                    <a:blip r:embed="rId11"/>
+                    <a:stretch>
+                      <a:fillRect/>
+                    </a:stretch>
+                  </pic:blipFill>
+                  <pic:spPr>
+                    <a:xfrm>
+                      <a:off x="0" y="0"/>
+                      <a:ext cx="1485900" cy="844504"/>
+                    </a:xfrm>
+                    <a:prstGeom prst="rect">
+                      <a:avLst/>
+                    </a:prstGeom>
+                  </pic:spPr>
+                </pic:pic>
+              </a:graphicData>
+            </a:graphic>
+          </wp:anchor>
+        </w:drawing>
+      </w:r>
+      <w:r>
+        <mc:AlternateContent>
+          <mc:Choice Requires="wps">
+            <w:drawing>
+              <wp:anchor distT="0" distB="0" distL="114300" distR="114300" simplePos="0" relativeHeight="251663360" behindDoc="0" locked="0" layoutInCell="1" allowOverlap="1" wp14:anchorId="39AEB0B2" wp14:editId="7DBD7287">
+                <wp:simplePos x="0" y="0"/>
+                <wp:positionH relativeFrom="column">
+                  <wp:posOffset>2857500</wp:posOffset>
+                </wp:positionH>
+                <wp:positionV relativeFrom="paragraph">
+                  <wp:posOffset>1409700</wp:posOffset>
+                </wp:positionV>
+                <wp:extent cx="1485900" cy="400110"/>
+                <wp:effectExtent l="0" t="0" r="0" b="0"/>
+                <wp:wrapNone/>
+                <wp:docPr id="13" name="ZoneTexte 12">
+                  <a:extLst xmlns:a="http://schemas.openxmlformats.org/drawingml/2006/main">
+                    <a:ext uri="{FF2B5EF4-FFF2-40B4-BE49-F238E27FC236}">
+                      <a16:creationId xmlns:a16="http://schemas.microsoft.com/office/drawing/2014/main" id="{305A9231-EDE1-D44B-F088-08FCB116A39B}"/>
+                    </a:ext>
+                  </a:extLst>
+                </wp:docPr>
+                <wp:cNvGraphicFramePr/>
+                <a:graphic xmlns:a="http://schemas.openxmlformats.org/drawingml/2006/main">
+                  <a:graphicData uri="http://schemas.microsoft.com/office/word/2010/wordprocessingShape">
+                    <wps:wsp>
+                      <wps:cNvSpPr txBox="1"/>
+                      <wps:spPr>
+                        <a:xfrm>
+                          <a:off x="0" y="0"/>
+                          <a:ext cx="1485900" cy="400110"/>
+                        </a:xfrm>
+                        <a:prstGeom prst="rect">
+                          <a:avLst/>
+                        </a:prstGeom>
+                        <a:noFill/>
+                      </wps:spPr>
+                      <wps:txbx>
+                        <w:txbxContent>
+                          <w:p>
+                            <w:pPr>
+                              <w:jc w:val="center"/>
+                              <w:rPr>
+                                <w:rFonts w:hAnsi="Calibri"/>
+                                <w:color w:val="000000" w:themeColor="text1"/>
+                                <w:kern w:val="24"/>
+                                <w:sz w:val="20"/>
+                                <w:szCs w:val="20"/>
+                                <w14:ligatures w14:val="none"/>
+                              </w:rPr>
+                            </w:pPr>
+                            <w:r>
+                              <w:rPr>
+                                <w:rFonts w:hAnsi="Calibri"/>
+                                <w:color w:val="000000" w:themeColor="text1"/>
+                                <w:kern w:val="24"/>
+                                <w:sz w:val="20"/>
+                                <w:szCs w:val="20"/>
+                              </w:rPr>
+                              <w:t>On identifie zone intérêt</w:t>
+                            </w:r>
+                          </w:p>
+                        </w:txbxContent>
+                      </wps:txbx>
+                      <wps:bodyPr wrap="square" rtlCol="0">
+                        <a:spAutoFit/>
+                      </wps:bodyPr>
+                    </wps:wsp>
+                  </a:graphicData>
+                </a:graphic>
+              </wp:anchor>
+            </w:drawing>
+          </mc:Choice>
+          <mc:Fallback>
+            <w:pict>
+              <v:shape w14:anchorId="39AEB0B2" id="ZoneTexte 12" o:spid="_x0000_s1037" type="#_x0000_t202" style="position:absolute;margin-left:225pt;margin-top:111pt;width:117pt;height:31.5pt;z-index:251663360;visibility:visible;mso-wrap-style:square;mso-wrap-distance-left:9pt;mso-wrap-distance-top:0;mso-wrap-distance-right:9pt;mso-wrap-distance-bottom:0;mso-position-horizontal:absolute;mso-position-horizontal-relative:text;mso-position-vertical:absolute;mso-position-vertical-relative:text;v-text-anchor:top" o:gfxdata="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" filled="f" stroked="f">
+                <v:textbox style="mso-fit-shape-to-text:t">
+                  <w:txbxContent>
+                    <w:p>
+                      <w:pPr>
+                        <w:jc w:val="center"/>
+                        <w:rPr>
+                          <w:rFonts w:hAnsi="Calibri"/>
+                          <w:color w:val="000000" w:themeColor="text1"/>
+                          <w:kern w:val="24"/>
+                          <w:sz w:val="20"/>
+                          <w:szCs w:val="20"/>
+                          <w14:ligatures w14:val="none"/>
+                        </w:rPr>
+                      </w:pPr>
+                      <w:r>
+                        <w:rPr>
+                          <w:rFonts w:hAnsi="Calibri"/>
+                          <w:color w:val="000000" w:themeColor="text1"/>
+                          <w:kern w:val="24"/>
+                          <w:sz w:val="20"/>
+                          <w:szCs w:val="20"/>
+                        </w:rPr>
+                        <w:t>On identifie zone intérêt</w:t>
+                      </w:r>
+                    </w:p>
+                  </w:txbxContent>
+                </v:textbox>
+              </v:shape>
+            </w:pict>
+          </mc:Fallback>
+        </mc:AlternateContent>
+      </w:r>
+      <w:r>
+        <w:drawing>
+          <wp:anchor distT="0" distB="0" distL="114300" distR="114300" simplePos="0" relativeHeight="251664384" behindDoc="0" locked="0" layoutInCell="1" allowOverlap="1" wp14:anchorId="67DFAB63" wp14:editId="405547EE">
+            <wp:simplePos x="0" y="0"/>
+            <wp:positionH relativeFrom="column">
+              <wp:posOffset>5257800</wp:posOffset>
+            </wp:positionH>
+            <wp:positionV relativeFrom="paragraph">
+              <wp:posOffset>457200</wp:posOffset>
+            </wp:positionV>
+            <wp:extent cx="1485900" cy="844504"/>
+            <wp:effectExtent l="0" t="0" r="0" b="0"/>
+            <wp:wrapNone/>
+            <wp:docPr id="14" name="Image 13" descr="Une image contenant capture d’écran, obscurité, noir&#10;&#10;Le contenu généré par l’IA peut être incorrect.">
+              <a:extLst xmlns:a="http://schemas.openxmlformats.org/drawingml/2006/main">
+                <a:ext uri="{FF2B5EF4-FFF2-40B4-BE49-F238E27FC236}">
+                  <a16:creationId xmlns:a16="http://schemas.microsoft.com/office/drawing/2014/main" id="{D0DEEC33-EAC2-D283-7544-48890B1CEFA7}"/>
+                </a:ext>
+              </a:extLst>
+            </wp:docPr>
+            <wp:cNvGraphicFramePr>
+              <a:graphicFrameLocks xmlns:a="http://schemas.openxmlformats.org/drawingml/2006/main" noChangeAspect="1"/>
+            </wp:cNvGraphicFramePr>
+            <a:graphic xmlns:a="http://schemas.openxmlformats.org/drawingml/2006/main">
+              <a:graphicData uri="http://schemas.openxmlformats.org/drawingml/2006/picture">
+                <pic:pic xmlns:pic="http://schemas.openxmlformats.org/drawingml/2006/picture">
+                  <pic:nvPicPr>
+                    <pic:cNvPr id="14" name="Image 13" descr="Une image contenant capture d’écran, obscurité, noir&#10;&#10;Le contenu généré par l’IA peut être incorrect.">
+                      <a:extLst>
+                        <a:ext uri="{FF2B5EF4-FFF2-40B4-BE49-F238E27FC236}">
+                          <a16:creationId xmlns:a16="http://schemas.microsoft.com/office/drawing/2014/main" id="{D0DEEC33-EAC2-D283-7544-48890B1CEFA7}"/>
+                        </a:ext>
+                      </a:extLst>
+                    </pic:cNvPr>
+                    <pic:cNvPicPr>
+                      <a:picLocks noChangeAspect="1"/>
+                    </pic:cNvPicPr>
+                  </pic:nvPicPr>
+                  <pic:blipFill>
+                    <a:blip r:embed="rId11"/>
+                    <a:stretch>
+                      <a:fillRect/>
+                    </a:stretch>
+                  </pic:blipFill>
+                  <pic:spPr>
+                    <a:xfrm>
+                      <a:off x="0" y="0"/>
+                      <a:ext cx="1485900" cy="844504"/>
+                    </a:xfrm>
+                    <a:prstGeom prst="rect">
+                      <a:avLst/>
+                    </a:prstGeom>
+                  </pic:spPr>
+                </pic:pic>
+              </a:graphicData>
+            </a:graphic>
+          </wp:anchor>
+        </w:drawing>
+      </w:r>
+      <w:r>
+        <mc:AlternateContent>
+          <mc:Choice Requires="wps">
+            <w:drawing>
+              <wp:anchor distT="0" distB="0" distL="114300" distR="114300" simplePos="0" relativeHeight="251665408" behindDoc="0" locked="0" layoutInCell="1" allowOverlap="1" wp14:anchorId="58FE993E" wp14:editId="3A49C859">
+                <wp:simplePos x="0" y="0"/>
+                <wp:positionH relativeFrom="column">
+                  <wp:posOffset>5257800</wp:posOffset>
+                </wp:positionH>
+                <wp:positionV relativeFrom="paragraph">
+                  <wp:posOffset>1409700</wp:posOffset>
+                </wp:positionV>
+                <wp:extent cx="1485900" cy="400110"/>
+                <wp:effectExtent l="0" t="0" r="0" b="0"/>
+                <wp:wrapNone/>
+                <wp:docPr id="15" name="ZoneTexte 14">
+                  <a:extLst xmlns:a="http://schemas.openxmlformats.org/drawingml/2006/main">
+                    <a:ext uri="{FF2B5EF4-FFF2-40B4-BE49-F238E27FC236}">
+                      <a16:creationId xmlns:a16="http://schemas.microsoft.com/office/drawing/2014/main" id="{2E2525AD-8CC3-A0DB-CCA8-709134A5CDCC}"/>
+                    </a:ext>
+                  </a:extLst>
+                </wp:docPr>
+                <wp:cNvGraphicFramePr/>
+                <a:graphic xmlns:a="http://schemas.openxmlformats.org/drawingml/2006/main">
+                  <a:graphicData uri="http://schemas.microsoft.com/office/word/2010/wordprocessingShape">
+                    <wps:wsp>
+                      <wps:cNvSpPr txBox="1"/>
+                      <wps:spPr>
+                        <a:xfrm>
+                          <a:off x="0" y="0"/>
+                          <a:ext cx="1485900" cy="400110"/>
+                        </a:xfrm>
+                        <a:prstGeom prst="rect">
+                          <a:avLst/>
+                        </a:prstGeom>
+                        <a:noFill/>
+                      </wps:spPr>
+                      <wps:txbx>
+                        <w:txbxContent>
+                          <w:p>
+                            <w:pPr>
+                              <w:jc w:val="center"/>
+                              <w:rPr>
+                                <w:rFonts w:hAnsi="Calibri"/>
+                                <w:color w:val="000000" w:themeColor="text1"/>
+                                <w:kern w:val="24"/>
+                                <w:sz w:val="20"/>
+                                <w:szCs w:val="20"/>
+                                <w14:ligatures w14:val="none"/>
+                              </w:rPr>
+                            </w:pPr>
+                            <w:r>
+                              <w:rPr>
+                                <w:rFonts w:hAnsi="Calibri"/>
+                                <w:color w:val="000000" w:themeColor="text1"/>
+                                <w:kern w:val="24"/>
+                                <w:sz w:val="20"/>
+                                <w:szCs w:val="20"/>
+                              </w:rPr>
+                              <w:t>On passe en gris puis en binaire noir et blanc</w:t>
+                            </w:r>
+                          </w:p>
+                        </w:txbxContent>
+                      </wps:txbx>
+                      <wps:bodyPr wrap="square" rtlCol="0">
+                        <a:spAutoFit/>
+                      </wps:bodyPr>
+                    </wps:wsp>
+                  </a:graphicData>
+                </a:graphic>
+              </wp:anchor>
+            </w:drawing>
+          </mc:Choice>
+          <mc:Fallback>
+            <w:pict>
+              <v:shape w14:anchorId="58FE993E" id="ZoneTexte 14" o:spid="_x0000_s1038" type="#_x0000_t202" style="position:absolute;margin-left:414pt;margin-top:111pt;width:117pt;height:31.5pt;z-index:251665408;visibility:visible;mso-wrap-style:square;mso-wrap-distance-left:9pt;mso-wrap-distance-top:0;mso-wrap-distance-right:9pt;mso-wrap-distance-bottom:0;mso-position-horizontal:absolute;mso-position-horizontal-relative:text;mso-position-vertical:absolute;mso-position-vertical-relative:text;v-text-anchor:top" o:gfxdata="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" filled="f" stroked="f">
+                <v:textbox style="mso-fit-shape-to-text:t">
+                  <w:txbxContent>
+                    <w:p>
+                      <w:pPr>
+                        <w:jc w:val="center"/>
+                        <w:rPr>
+                          <w:rFonts w:hAnsi="Calibri"/>
+                          <w:color w:val="000000" w:themeColor="text1"/>
+                          <w:kern w:val="24"/>
+                          <w:sz w:val="20"/>
+                          <w:szCs w:val="20"/>
+                          <w14:ligatures w14:val="none"/>
+                        </w:rPr>
+                      </w:pPr>
+                      <w:r>
+                        <w:rPr>
+                          <w:rFonts w:hAnsi="Calibri"/>
+                          <w:color w:val="000000" w:themeColor="text1"/>
+                          <w:kern w:val="24"/>
+                          <w:sz w:val="20"/>
+                          <w:szCs w:val="20"/>
+                        </w:rPr>
+                        <w:t>On passe en gris puis en binaire noir et blanc</w:t>
+                      </w:r>
+                    </w:p>
+                  </w:txbxContent>
+                </v:textbox>
+              </v:shape>
+            </w:pict>
+          </mc:Fallback>
+        </mc:AlternateContent>
+      </w:r>
+      <w:r>
+        <mc:AlternateContent>
+          <mc:Choice Requires="wps">
+            <w:drawing>
+              <wp:anchor distT="0" distB="0" distL="114300" distR="114300" simplePos="0" relativeHeight="251666432" behindDoc="0" locked="0" layoutInCell="1" allowOverlap="1" wp14:anchorId="3B97DC98" wp14:editId="4BF67A07">
+                <wp:simplePos x="0" y="0"/>
+                <wp:positionH relativeFrom="column">
+                  <wp:posOffset>4572000</wp:posOffset>
+                </wp:positionH>
+                <wp:positionV relativeFrom="paragraph">
+                  <wp:posOffset>1066800</wp:posOffset>
+                </wp:positionV>
+                <wp:extent cx="508000" cy="0"/>
+                <wp:effectExtent l="0" t="76200" r="25400" b="95250"/>
+                <wp:wrapNone/>
+                <wp:docPr id="16" name="Connecteur droit avec flèche 15">
+                  <a:extLst xmlns:a="http://schemas.openxmlformats.org/drawingml/2006/main">
+                    <a:ext uri="{FF2B5EF4-FFF2-40B4-BE49-F238E27FC236}">
+                      <a16:creationId xmlns:a16="http://schemas.microsoft.com/office/drawing/2014/main" id="{C09F6A0D-0056-6B22-C6F2-A1CCDEB1A039}"/>
+                    </a:ext>
+                  </a:extLst>
+                </wp:docPr>
+                <wp:cNvGraphicFramePr/>
+                <a:graphic xmlns:a="http://schemas.openxmlformats.org/drawingml/2006/main">
+                  <a:graphicData uri="http://schemas.microsoft.com/office/word/2010/wordprocessingShape">
+                    <wps:wsp>
+                      <wps:cNvCnPr/>
+                      <wps:spPr>
+                        <a:xfrm>
+                          <a:off x="0" y="0"/>
+                          <a:ext cx="508000" cy="0"/>
+                        </a:xfrm>
+                        <a:prstGeom prst="straightConnector1">
+                          <a:avLst/>
+                        </a:prstGeom>
+                        <a:ln>
+                          <a:solidFill>
+                            <a:schemeClr val="tx1"/>
+                          </a:solidFill>
+                          <a:tailEnd type="triangle"/>
+                        </a:ln>
+                      </wps:spPr>
+                      <wps:style>
+                        <a:lnRef idx="2">
+                          <a:schemeClr val="accent1"/>
+                        </a:lnRef>
+                        <a:fillRef idx="0">
+                          <a:schemeClr val="accent1"/>
+                        </a:fillRef>
+                        <a:effectRef idx="1">
+                          <a:schemeClr val="accent1"/>
+                        </a:effectRef>
+                        <a:fontRef idx="minor">
+                          <a:schemeClr val="tx1"/>
+                        </a:fontRef>
+                      </wps:style>
+                      <wps:bodyPr/>
+                    </wps:wsp>
+                  </a:graphicData>
+                </a:graphic>
+              </wp:anchor>
+            </w:drawing>
+          </mc:Choice>
+          <mc:Fallback>
+            <w:pict>
+              <v:shape w14:anchorId="54CC1DDF" id="Connecteur droit avec flèche 15" o:spid="_x0000_s1026" type="#_x0000_t32" style="position:absolute;margin-left:5in;margin-top:84pt;width:40pt;height:0;z-index:251666432;visibility:visible;mso-wrap-style:square;mso-wrap-distance-left:9pt;mso-wrap-distance-top:0;mso-wrap-distance-right:9pt;mso-wrap-distance-bottom:0;mso-position-horizontal:absolute;mso-position-horizontal-relative:text;mso-position-vertical:absolute;mso-position-vertical-relative:text" o:gfxdata="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" strokecolor="black [3213]" strokeweight="1pt">
+                <v:stroke endarrow="block" joinstyle="miter"/>
+              </v:shape>
+            </w:pict>
+          </mc:Fallback>
+        </mc:AlternateContent>
+      </w:r>
+      <w:r>
+        <w:drawing>
+          <wp:anchor distT="0" distB="0" distL="114300" distR="114300" simplePos="0" relativeHeight="251667456" behindDoc="0" locked="0" layoutInCell="1" allowOverlap="1" wp14:anchorId="49B42AF8" wp14:editId="22B54377">
+            <wp:simplePos x="0" y="0"/>
+            <wp:positionH relativeFrom="column">
+              <wp:posOffset>7658100</wp:posOffset>
+            </wp:positionH>
+            <wp:positionV relativeFrom="paragraph">
+              <wp:posOffset>457200</wp:posOffset>
+            </wp:positionV>
+            <wp:extent cx="1485900" cy="844504"/>
+            <wp:effectExtent l="0" t="0" r="0" b="0"/>
+            <wp:wrapNone/>
+            <wp:docPr id="17" name="Image 16" descr="Une image contenant capture d’écran, obscurité, noir&#10;&#10;Le contenu généré par l’IA peut être incorrect.">
+              <a:extLst xmlns:a="http://schemas.openxmlformats.org/drawingml/2006/main">
+                <a:ext uri="{FF2B5EF4-FFF2-40B4-BE49-F238E27FC236}">
+                  <a16:creationId xmlns:a16="http://schemas.microsoft.com/office/drawing/2014/main" id="{F666E7BD-023D-F766-929C-FBEBFA55BFE9}"/>
+                </a:ext>
+              </a:extLst>
+            </wp:docPr>
+            <wp:cNvGraphicFramePr>
+              <a:graphicFrameLocks xmlns:a="http://schemas.openxmlformats.org/drawingml/2006/main" noChangeAspect="1"/>
+            </wp:cNvGraphicFramePr>
+            <a:graphic xmlns:a="http://schemas.openxmlformats.org/drawingml/2006/main">
+              <a:graphicData uri="http://schemas.openxmlformats.org/drawingml/2006/picture">
+                <pic:pic xmlns:pic="http://schemas.openxmlformats.org/drawingml/2006/picture">
+                  <pic:nvPicPr>
+                    <pic:cNvPr id="17" name="Image 16" descr="Une image contenant capture d’écran, obscurité, noir&#10;&#10;Le contenu généré par l’IA peut être incorrect.">
+                      <a:extLst>
+                        <a:ext uri="{FF2B5EF4-FFF2-40B4-BE49-F238E27FC236}">
+                          <a16:creationId xmlns:a16="http://schemas.microsoft.com/office/drawing/2014/main" id="{F666E7BD-023D-F766-929C-FBEBFA55BFE9}"/>
+                        </a:ext>
+                      </a:extLst>
+                    </pic:cNvPr>
+                    <pic:cNvPicPr>
+                      <a:picLocks noChangeAspect="1"/>
+                    </pic:cNvPicPr>
+                  </pic:nvPicPr>
+                  <pic:blipFill>
+                    <a:blip r:embed="rId11"/>
+                    <a:stretch>
+                      <a:fillRect/>
+                    </a:stretch>
+                  </pic:blipFill>
+                  <pic:spPr>
+                    <a:xfrm>
+                      <a:off x="0" y="0"/>
+                      <a:ext cx="1485900" cy="844504"/>
+                    </a:xfrm>
+                    <a:prstGeom prst="rect">
+                      <a:avLst/>
+                    </a:prstGeom>
+                  </pic:spPr>
+                </pic:pic>
+              </a:graphicData>
+            </a:graphic>
+          </wp:anchor>
+        </w:drawing>
+      </w:r>
+      <w:r>
+        <mc:AlternateContent>
+          <mc:Choice Requires="wps">
+            <w:drawing>
+              <wp:anchor distT="0" distB="0" distL="114300" distR="114300" simplePos="0" relativeHeight="251668480" behindDoc="0" locked="0" layoutInCell="1" allowOverlap="1" wp14:anchorId="21D72165" wp14:editId="5528D138">
+                <wp:simplePos x="0" y="0"/>
+                <wp:positionH relativeFrom="column">
+                  <wp:posOffset>7658100</wp:posOffset>
+                </wp:positionH>
+                <wp:positionV relativeFrom="paragraph">
+                  <wp:posOffset>1409700</wp:posOffset>
+                </wp:positionV>
+                <wp:extent cx="1485900" cy="246221"/>
+                <wp:effectExtent l="0" t="0" r="0" b="0"/>
+                <wp:wrapNone/>
+                <wp:docPr id="18" name="ZoneTexte 17">
+                  <a:extLst xmlns:a="http://schemas.openxmlformats.org/drawingml/2006/main">
+                    <a:ext uri="{FF2B5EF4-FFF2-40B4-BE49-F238E27FC236}">
+                      <a16:creationId xmlns:a16="http://schemas.microsoft.com/office/drawing/2014/main" id="{3292E968-294A-43FD-5D40-67A4C030774D}"/>
+                    </a:ext>
+                  </a:extLst>
+                </wp:docPr>
+                <wp:cNvGraphicFramePr/>
+                <a:graphic xmlns:a="http://schemas.openxmlformats.org/drawingml/2006/main">
+                  <a:graphicData uri="http://schemas.microsoft.com/office/word/2010/wordprocessingShape">
+                    <wps:wsp>
+                      <wps:cNvSpPr txBox="1"/>
+                      <wps:spPr>
+                        <a:xfrm>
+                          <a:off x="0" y="0"/>
+                          <a:ext cx="1485900" cy="246221"/>
+                        </a:xfrm>
+                        <a:prstGeom prst="rect">
+                          <a:avLst/>
+                        </a:prstGeom>
+                        <a:noFill/>
+                      </wps:spPr>
+                      <wps:txbx>
+                        <w:txbxContent>
+                          <w:p>
+                            <w:pPr>
+                              <w:jc w:val="center"/>
+                              <w:rPr>
+                                <w:rFonts w:hAnsi="Calibri"/>
+                                <w:color w:val="000000" w:themeColor="text1"/>
+                                <w:kern w:val="24"/>
+                                <w:sz w:val="20"/>
+                                <w:szCs w:val="20"/>
+                                <w14:ligatures w14:val="none"/>
+                              </w:rPr>
+                            </w:pPr>
+                            <w:r>
+                              <w:rPr>
+                                <w:rFonts w:hAnsi="Calibri"/>
+                                <w:color w:val="000000" w:themeColor="text1"/>
+                                <w:kern w:val="24"/>
+                                <w:sz w:val="20"/>
+                                <w:szCs w:val="20"/>
+                              </w:rPr>
+                              <w:t>On identifie rectangle</w:t>
+                            </w:r>
+                          </w:p>
+                        </w:txbxContent>
+                      </wps:txbx>
+                      <wps:bodyPr wrap="square" rtlCol="0">
+                        <a:spAutoFit/>
+                      </wps:bodyPr>
+                    </wps:wsp>
+                  </a:graphicData>
+                </a:graphic>
+              </wp:anchor>
+            </w:drawing>
+          </mc:Choice>
+          <mc:Fallback>
+            <w:pict>
+              <v:shape w14:anchorId="21D72165" id="ZoneTexte 17" o:spid="_x0000_s1039" type="#_x0000_t202" style="position:absolute;margin-left:603pt;margin-top:111pt;width:117pt;height:19.4pt;z-index:251668480;visibility:visible;mso-wrap-style:square;mso-wrap-distance-left:9pt;mso-wrap-distance-top:0;mso-wrap-distance-right:9pt;mso-wrap-distance-bottom:0;mso-position-horizontal:absolute;mso-position-horizontal-relative:text;mso-position-vertical:absolute;mso-position-vertical-relative:text;v-text-anchor:top" o:gfxdata="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" filled="f" stroked="f">
+                <v:textbox style="mso-fit-shape-to-text:t">
+                  <w:txbxContent>
+                    <w:p>
+                      <w:pPr>
+                        <w:jc w:val="center"/>
+                        <w:rPr>
+                          <w:rFonts w:hAnsi="Calibri"/>
+                          <w:color w:val="000000" w:themeColor="text1"/>
+                          <w:kern w:val="24"/>
+                          <w:sz w:val="20"/>
+                          <w:szCs w:val="20"/>
+                          <w14:ligatures w14:val="none"/>
+                        </w:rPr>
+                      </w:pPr>
+                      <w:r>
+                        <w:rPr>
+                          <w:rFonts w:hAnsi="Calibri"/>
+                          <w:color w:val="000000" w:themeColor="text1"/>
+                          <w:kern w:val="24"/>
+                          <w:sz w:val="20"/>
+                          <w:szCs w:val="20"/>
+                        </w:rPr>
+                        <w:t>On identifie rectangle</w:t>
+                      </w:r>
+                    </w:p>
+                  </w:txbxContent>
+                </v:textbox>
+              </v:shape>
+            </w:pict>
+          </mc:Fallback>
+        </mc:AlternateContent>
+      </w:r>
+      <w:r>
+        <mc:AlternateContent>
+          <mc:Choice Requires="wps">
+            <w:drawing>
+              <wp:anchor distT="0" distB="0" distL="114300" distR="114300" simplePos="0" relativeHeight="251669504" behindDoc="0" locked="0" layoutInCell="1" allowOverlap="1" wp14:anchorId="19EF2DA8" wp14:editId="07B7577B">
+                <wp:simplePos x="0" y="0"/>
+                <wp:positionH relativeFrom="column">
+                  <wp:posOffset>6972300</wp:posOffset>
+                </wp:positionH>
+                <wp:positionV relativeFrom="paragraph">
+                  <wp:posOffset>1066800</wp:posOffset>
+                </wp:positionV>
+                <wp:extent cx="508000" cy="0"/>
+                <wp:effectExtent l="0" t="76200" r="25400" b="95250"/>
+                <wp:wrapNone/>
+                <wp:docPr id="19" name="Connecteur droit avec flèche 18">
+                  <a:extLst xmlns:a="http://schemas.openxmlformats.org/drawingml/2006/main">
+                    <a:ext uri="{FF2B5EF4-FFF2-40B4-BE49-F238E27FC236}">
+                      <a16:creationId xmlns:a16="http://schemas.microsoft.com/office/drawing/2014/main" id="{8840686F-A241-A55D-F81C-F7DDF29DCBFE}"/>
+                    </a:ext>
+                  </a:extLst>
+                </wp:docPr>
+                <wp:cNvGraphicFramePr/>
+                <a:graphic xmlns:a="http://schemas.openxmlformats.org/drawingml/2006/main">
+                  <a:graphicData uri="http://schemas.microsoft.com/office/word/2010/wordprocessingShape">
+                    <wps:wsp>
+                      <wps:cNvCnPr/>
+                      <wps:spPr>
+                        <a:xfrm>
+                          <a:off x="0" y="0"/>
+                          <a:ext cx="508000" cy="0"/>
+                        </a:xfrm>
+                        <a:prstGeom prst="straightConnector1">
+                          <a:avLst/>
+                        </a:prstGeom>
+                        <a:ln>
+                          <a:solidFill>
+                            <a:schemeClr val="tx1"/>
+                          </a:solidFill>
+                          <a:tailEnd type="triangle"/>
+                        </a:ln>
+                      </wps:spPr>
+                      <wps:style>
+                        <a:lnRef idx="2">
+                          <a:schemeClr val="accent1"/>
+                        </a:lnRef>
+                        <a:fillRef idx="0">
+                          <a:schemeClr val="accent1"/>
+                        </a:fillRef>
+                        <a:effectRef idx="1">
+                          <a:schemeClr val="accent1"/>
+                        </a:effectRef>
+                        <a:fontRef idx="minor">
+                          <a:schemeClr val="tx1"/>
+                        </a:fontRef>
+                      </wps:style>
+                      <wps:bodyPr/>
+                    </wps:wsp>
+                  </a:graphicData>
+                </a:graphic>
+              </wp:anchor>
+            </w:drawing>
+          </mc:Choice>
+          <mc:Fallback>
+            <w:pict>
+              <v:shape w14:anchorId="2629A2E9" id="Connecteur droit avec flèche 18" o:spid="_x0000_s1026" type="#_x0000_t32" style="position:absolute;margin-left:549pt;margin-top:84pt;width:40pt;height:0;z-index:251669504;visibility:visible;mso-wrap-style:square;mso-wrap-distance-left:9pt;mso-wrap-distance-top:0;mso-wrap-distance-right:9pt;mso-wrap-distance-bottom:0;mso-position-horizontal:absolute;mso-position-horizontal-relative:text;mso-position-vertical:absolute;mso-position-vertical-relative:text" o:gfxdata="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" strokecolor="black [3213]" strokeweight="1pt">
+                <v:stroke endarrow="block" joinstyle="miter"/>
+              </v:shape>
+            </w:pict>
+          </mc:Fallback>
+        </mc:AlternateContent>
+      </w:r>
+      <w:r>
+        <w:drawing>
+          <wp:anchor distT="0" distB="0" distL="114300" distR="114300" simplePos="0" relativeHeight="251670528" behindDoc="0" locked="0" layoutInCell="1" allowOverlap="1" wp14:anchorId="1FA3CE2C" wp14:editId="3302957B">
+            <wp:simplePos x="0" y="0"/>
+            <wp:positionH relativeFrom="column">
+              <wp:posOffset>457200</wp:posOffset>
+            </wp:positionH>
+            <wp:positionV relativeFrom="paragraph">
+              <wp:posOffset>1943100</wp:posOffset>
+            </wp:positionV>
+            <wp:extent cx="1485900" cy="835819"/>
+            <wp:effectExtent l="0" t="0" r="0" b="2540"/>
+            <wp:wrapNone/>
+            <wp:docPr id="20" name="Image 19" descr="Une image contenant carte, texte, puzzle, intérieur&#10;&#10;Le contenu généré par l’IA peut être incorrect.">
+              <a:extLst xmlns:a="http://schemas.openxmlformats.org/drawingml/2006/main">
+                <a:ext uri="{FF2B5EF4-FFF2-40B4-BE49-F238E27FC236}">
+                  <a16:creationId xmlns:a16="http://schemas.microsoft.com/office/drawing/2014/main" id="{E45F231A-5960-522E-1484-C2BEB086AFFB}"/>
+                </a:ext>
+              </a:extLst>
+            </wp:docPr>
+            <wp:cNvGraphicFramePr>
+              <a:graphicFrameLocks xmlns:a="http://schemas.openxmlformats.org/drawingml/2006/main" noChangeAspect="1"/>
+            </wp:cNvGraphicFramePr>
+            <a:graphic xmlns:a="http://schemas.openxmlformats.org/drawingml/2006/main">
+              <a:graphicData uri="http://schemas.openxmlformats.org/drawingml/2006/picture">
+                <pic:pic xmlns:pic="http://schemas.openxmlformats.org/drawingml/2006/picture">
+                  <pic:nvPicPr>
+                    <pic:cNvPr id="20" name="Image 19" descr="Une image contenant carte, texte, puzzle, intérieur&#10;&#10;Le contenu généré par l’IA peut être incorrect.">
+                      <a:extLst>
+                        <a:ext uri="{FF2B5EF4-FFF2-40B4-BE49-F238E27FC236}">
+                          <a16:creationId xmlns:a16="http://schemas.microsoft.com/office/drawing/2014/main" id="{E45F231A-5960-522E-1484-C2BEB086AFFB}"/>
+                        </a:ext>
+                      </a:extLst>
+                    </pic:cNvPr>
+                    <pic:cNvPicPr>
+                      <a:picLocks noChangeAspect="1"/>
+                    </pic:cNvPicPr>
+                  </pic:nvPicPr>
+                  <pic:blipFill>
+                    <a:blip r:embed="rId10" cstate="print">
+                      <a:extLst>
+                        <a:ext uri="{28A0092B-C50C-407E-A947-70E740481C1C}">
+                          <a14:useLocalDpi xmlns:a14="http://schemas.microsoft.com/office/drawing/2010/main" val="0"/>
+                        </a:ext>
+                      </a:extLst>
+                    </a:blip>
+                    <a:stretch>
+                      <a:fillRect/>
+                    </a:stretch>
+                  </pic:blipFill>
+                  <pic:spPr>
+                    <a:xfrm>
+                      <a:off x="0" y="0"/>
+                      <a:ext cx="1485900" cy="835819"/>
+                    </a:xfrm>
+                    <a:prstGeom prst="rect">
+                      <a:avLst/>
+                    </a:prstGeom>
+                  </pic:spPr>
+                </pic:pic>
+              </a:graphicData>
+            </a:graphic>
+          </wp:anchor>
+        </w:drawing>
+      </w:r>
+      <w:r>
+        <mc:AlternateContent>
+          <mc:Choice Requires="wps">
+            <w:drawing>
+              <wp:anchor distT="0" distB="0" distL="114300" distR="114300" simplePos="0" relativeHeight="251671552" behindDoc="0" locked="0" layoutInCell="1" allowOverlap="1" wp14:anchorId="47123C3F" wp14:editId="219E136E">
+                <wp:simplePos x="0" y="0"/>
+                <wp:positionH relativeFrom="column">
+                  <wp:posOffset>457200</wp:posOffset>
+                </wp:positionH>
+                <wp:positionV relativeFrom="paragraph">
+                  <wp:posOffset>2895600</wp:posOffset>
+                </wp:positionV>
+                <wp:extent cx="1485900" cy="246221"/>
+                <wp:effectExtent l="0" t="0" r="0" b="0"/>
+                <wp:wrapNone/>
+                <wp:docPr id="21" name="ZoneTexte 20">
+                  <a:extLst xmlns:a="http://schemas.openxmlformats.org/drawingml/2006/main">
+                    <a:ext uri="{FF2B5EF4-FFF2-40B4-BE49-F238E27FC236}">
+                      <a16:creationId xmlns:a16="http://schemas.microsoft.com/office/drawing/2014/main" id="{EDF3284F-1350-70EB-A42A-3D5C8D3791B7}"/>
+                    </a:ext>
+                  </a:extLst>
+                </wp:docPr>
+                <wp:cNvGraphicFramePr/>
+                <a:graphic xmlns:a="http://schemas.openxmlformats.org/drawingml/2006/main">
+                  <a:graphicData uri="http://schemas.microsoft.com/office/word/2010/wordprocessingShape">
+                    <wps:wsp>
+                      <wps:cNvSpPr txBox="1"/>
+                      <wps:spPr>
+                        <a:xfrm>
+                          <a:off x="0" y="0"/>
+                          <a:ext cx="1485900" cy="246221"/>
+                        </a:xfrm>
+                        <a:prstGeom prst="rect">
+                          <a:avLst/>
+                        </a:prstGeom>
+                        <a:noFill/>
+                      </wps:spPr>
+                      <wps:txbx>
+                        <w:txbxContent>
+                          <w:p>
+                            <w:pPr>
+                              <w:jc w:val="center"/>
+                              <w:rPr>
+                                <w:rFonts w:hAnsi="Calibri"/>
+                                <w:color w:val="000000" w:themeColor="text1"/>
+                                <w:kern w:val="24"/>
+                                <w:sz w:val="20"/>
+                                <w:szCs w:val="20"/>
+                                <w14:ligatures w14:val="none"/>
+                              </w:rPr>
+                            </w:pPr>
+                            <w:r>
+                              <w:rPr>
+                                <w:rFonts w:hAnsi="Calibri"/>
+                                <w:color w:val="000000" w:themeColor="text1"/>
+                                <w:kern w:val="24"/>
+                                <w:sz w:val="20"/>
+                                <w:szCs w:val="20"/>
+                              </w:rPr>
+                              <w:t>Image de base</w:t>
+                            </w:r>
+                          </w:p>
+                        </w:txbxContent>
+                      </wps:txbx>
+                      <wps:bodyPr wrap="square" rtlCol="0">
+                        <a:spAutoFit/>
+                      </wps:bodyPr>
+                    </wps:wsp>
+                  </a:graphicData>
+                </a:graphic>
+              </wp:anchor>
+            </w:drawing>
+          </mc:Choice>
+          <mc:Fallback>
+            <w:pict>
+              <v:shape w14:anchorId="47123C3F" id="ZoneTexte 20" o:spid="_x0000_s1040" type="#_x0000_t202" style="position:absolute;margin-left:36pt;margin-top:228pt;width:117pt;height:19.4pt;z-index:251671552;visibility:visible;mso-wrap-style:square;mso-wrap-distance-left:9pt;mso-wrap-distance-top:0;mso-wrap-distance-right:9pt;mso-wrap-distance-bottom:0;mso-position-horizontal:absolute;mso-position-horizontal-relative:text;mso-position-vertical:absolute;mso-position-vertical-relative:text;v-text-anchor:top" o:gfxdata="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" filled="f" stroked="f">
+                <v:textbox style="mso-fit-shape-to-text:t">
+                  <w:txbxContent>
+                    <w:p>
+                      <w:pPr>
+                        <w:jc w:val="center"/>
+                        <w:rPr>
+                          <w:rFonts w:hAnsi="Calibri"/>
+                          <w:color w:val="000000" w:themeColor="text1"/>
+                          <w:kern w:val="24"/>
+                          <w:sz w:val="20"/>
+                          <w:szCs w:val="20"/>
+                          <w14:ligatures w14:val="none"/>
+                        </w:rPr>
+                      </w:pPr>
+                      <w:r>
+                        <w:rPr>
+                          <w:rFonts w:hAnsi="Calibri"/>
+                          <w:color w:val="000000" w:themeColor="text1"/>
+                          <w:kern w:val="24"/>
+                          <w:sz w:val="20"/>
+                          <w:szCs w:val="20"/>
+                        </w:rPr>
+                        <w:t>Image de base</w:t>
+                      </w:r>
+                    </w:p>
+                  </w:txbxContent>
+                </v:textbox>
+              </v:shape>
+            </w:pict>
+          </mc:Fallback>
+        </mc:AlternateContent>
+      </w:r>
+      <w:r>
+        <mc:AlternateContent>
+          <mc:Choice Requires="wps">
+            <w:drawing>
+              <wp:anchor distT="0" distB="0" distL="114300" distR="114300" simplePos="0" relativeHeight="251672576" behindDoc="0" locked="0" layoutInCell="1" allowOverlap="1" wp14:anchorId="485C34EF" wp14:editId="146783BA">
+                <wp:simplePos x="0" y="0"/>
+                <wp:positionH relativeFrom="column">
+                  <wp:posOffset>2152650</wp:posOffset>
+                </wp:positionH>
+                <wp:positionV relativeFrom="paragraph">
+                  <wp:posOffset>2533650</wp:posOffset>
+                </wp:positionV>
+                <wp:extent cx="508000" cy="0"/>
+                <wp:effectExtent l="0" t="76200" r="25400" b="95250"/>
+                <wp:wrapNone/>
+                <wp:docPr id="22" name="Connecteur droit avec flèche 21">
+                  <a:extLst xmlns:a="http://schemas.openxmlformats.org/drawingml/2006/main">
+                    <a:ext uri="{FF2B5EF4-FFF2-40B4-BE49-F238E27FC236}">
+                      <a16:creationId xmlns:a16="http://schemas.microsoft.com/office/drawing/2014/main" id="{96A92CD6-AE80-AC40-0034-D6FD831C3E9D}"/>
+                    </a:ext>
+                  </a:extLst>
+                </wp:docPr>
+                <wp:cNvGraphicFramePr/>
+                <a:graphic xmlns:a="http://schemas.openxmlformats.org/drawingml/2006/main">
+                  <a:graphicData uri="http://schemas.microsoft.com/office/word/2010/wordprocessingShape">
+                    <wps:wsp>
+                      <wps:cNvCnPr/>
+                      <wps:spPr>
+                        <a:xfrm>
+                          <a:off x="0" y="0"/>
+                          <a:ext cx="508000" cy="0"/>
+                        </a:xfrm>
+                        <a:prstGeom prst="straightConnector1">
+                          <a:avLst/>
+                        </a:prstGeom>
+                        <a:ln>
+                          <a:solidFill>
+                            <a:schemeClr val="tx1"/>
+                          </a:solidFill>
+                          <a:tailEnd type="triangle"/>
+                        </a:ln>
+                      </wps:spPr>
+                      <wps:style>
+                        <a:lnRef idx="2">
+                          <a:schemeClr val="accent1"/>
+                        </a:lnRef>
+                        <a:fillRef idx="0">
+                          <a:schemeClr val="accent1"/>
+                        </a:fillRef>
+                        <a:effectRef idx="1">
+                          <a:schemeClr val="accent1"/>
+                        </a:effectRef>
+                        <a:fontRef idx="minor">
+                          <a:schemeClr val="tx1"/>
+                        </a:fontRef>
+                      </wps:style>
+                      <wps:bodyPr/>
+                    </wps:wsp>
+                  </a:graphicData>
+                </a:graphic>
+              </wp:anchor>
+            </w:drawing>
+          </mc:Choice>
+          <mc:Fallback>
+            <w:pict>
+              <v:shape w14:anchorId="47F485A9" id="Connecteur droit avec flèche 21" o:spid="_x0000_s1026" type="#_x0000_t32" style="position:absolute;margin-left:169.5pt;margin-top:199.5pt;width:40pt;height:0;z-index:251672576;visibility:visible;mso-wrap-style:square;mso-wrap-distance-left:9pt;mso-wrap-distance-top:0;mso-wrap-distance-right:9pt;mso-wrap-distance-bottom:0;mso-position-horizontal:absolute;mso-position-horizontal-relative:text;mso-position-vertical:absolute;mso-position-vertical-relative:text" o:gfxdata="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" strokecolor="black [3213]" strokeweight="1pt">
+                <v:stroke endarrow="block" joinstyle="miter"/>
+              </v:shape>
+            </w:pict>
+          </mc:Fallback>
+        </mc:AlternateContent>
+      </w:r>
+      <w:r>
+        <w:drawing>
+          <wp:anchor distT="0" distB="0" distL="114300" distR="114300" simplePos="0" relativeHeight="251673600" behindDoc="0" locked="0" layoutInCell="1" allowOverlap="1" wp14:anchorId="6235344F" wp14:editId="1EE9E315">
+            <wp:simplePos x="0" y="0"/>
+            <wp:positionH relativeFrom="column">
+              <wp:posOffset>2857500</wp:posOffset>
+            </wp:positionH>
+            <wp:positionV relativeFrom="paragraph">
+              <wp:posOffset>1943100</wp:posOffset>
+            </wp:positionV>
+            <wp:extent cx="1485900" cy="844504"/>
+            <wp:effectExtent l="0" t="0" r="0" b="0"/>
+            <wp:wrapNone/>
+            <wp:docPr id="23" name="Image 22" descr="Une image contenant capture d’écran, obscurité, noir&#10;&#10;Le contenu généré par l’IA peut être incorrect.">
+              <a:extLst xmlns:a="http://schemas.openxmlformats.org/drawingml/2006/main">
+                <a:ext uri="{FF2B5EF4-FFF2-40B4-BE49-F238E27FC236}">
+                  <a16:creationId xmlns:a16="http://schemas.microsoft.com/office/drawing/2014/main" id="{442E788B-3AD8-9CFB-A292-40D75C55A174}"/>
+                </a:ext>
+              </a:extLst>
+            </wp:docPr>
+            <wp:cNvGraphicFramePr>
+              <a:graphicFrameLocks xmlns:a="http://schemas.openxmlformats.org/drawingml/2006/main" noChangeAspect="1"/>
+            </wp:cNvGraphicFramePr>
+            <a:graphic xmlns:a="http://schemas.openxmlformats.org/drawingml/2006/main">
+              <a:graphicData uri="http://schemas.openxmlformats.org/drawingml/2006/picture">
+                <pic:pic xmlns:pic="http://schemas.openxmlformats.org/drawingml/2006/picture">
+                  <pic:nvPicPr>
+                    <pic:cNvPr id="23" name="Image 22" descr="Une image contenant capture d’écran, obscurité, noir&#10;&#10;Le contenu généré par l’IA peut être incorrect.">
+                      <a:extLst>
+                        <a:ext uri="{FF2B5EF4-FFF2-40B4-BE49-F238E27FC236}">
+                          <a16:creationId xmlns:a16="http://schemas.microsoft.com/office/drawing/2014/main" id="{442E788B-3AD8-9CFB-A292-40D75C55A174}"/>
+                        </a:ext>
+                      </a:extLst>
+                    </pic:cNvPr>
+                    <pic:cNvPicPr>
+                      <a:picLocks noChangeAspect="1"/>
+                    </pic:cNvPicPr>
+                  </pic:nvPicPr>
+                  <pic:blipFill>
+                    <a:blip r:embed="rId11"/>
+                    <a:stretch>
+                      <a:fillRect/>
+                    </a:stretch>
+                  </pic:blipFill>
+                  <pic:spPr>
+                    <a:xfrm>
+                      <a:off x="0" y="0"/>
+                      <a:ext cx="1485900" cy="844504"/>
+                    </a:xfrm>
+                    <a:prstGeom prst="rect">
+                      <a:avLst/>
+                    </a:prstGeom>
+                  </pic:spPr>
+                </pic:pic>
+              </a:graphicData>
+            </a:graphic>
+          </wp:anchor>
+        </w:drawing>
+      </w:r>
+      <w:r>
+        <mc:AlternateContent>
+          <mc:Choice Requires="wps">
+            <w:drawing>
+              <wp:anchor distT="0" distB="0" distL="114300" distR="114300" simplePos="0" relativeHeight="251674624" behindDoc="0" locked="0" layoutInCell="1" allowOverlap="1" wp14:anchorId="50401751" wp14:editId="45CB599D">
+                <wp:simplePos x="0" y="0"/>
+                <wp:positionH relativeFrom="column">
+                  <wp:posOffset>2857500</wp:posOffset>
+                </wp:positionH>
+                <wp:positionV relativeFrom="paragraph">
+                  <wp:posOffset>2895600</wp:posOffset>
+                </wp:positionV>
+                <wp:extent cx="1485900" cy="400110"/>
+                <wp:effectExtent l="0" t="0" r="0" b="0"/>
+                <wp:wrapNone/>
+                <wp:docPr id="24" name="ZoneTexte 23">
+                  <a:extLst xmlns:a="http://schemas.openxmlformats.org/drawingml/2006/main">
+                    <a:ext uri="{FF2B5EF4-FFF2-40B4-BE49-F238E27FC236}">
+                      <a16:creationId xmlns:a16="http://schemas.microsoft.com/office/drawing/2014/main" id="{3DC3FF9F-4518-975F-D823-FB257B1D85B1}"/>
+                    </a:ext>
+                  </a:extLst>
+                </wp:docPr>
+                <wp:cNvGraphicFramePr/>
+                <a:graphic xmlns:a="http://schemas.openxmlformats.org/drawingml/2006/main">
+                  <a:graphicData uri="http://schemas.microsoft.com/office/word/2010/wordprocessingShape">
+                    <wps:wsp>
+                      <wps:cNvSpPr txBox="1"/>
+                      <wps:spPr>
+                        <a:xfrm>
+                          <a:off x="0" y="0"/>
+                          <a:ext cx="1485900" cy="400110"/>
+                        </a:xfrm>
+                        <a:prstGeom prst="rect">
+                          <a:avLst/>
+                        </a:prstGeom>
+                        <a:noFill/>
+                      </wps:spPr>
+                      <wps:txbx>
+                        <w:txbxContent>
+                          <w:p>
+                            <w:pPr>
+                              <w:jc w:val="center"/>
+                              <w:rPr>
+                                <w:rFonts w:hAnsi="Calibri"/>
+                                <w:color w:val="000000" w:themeColor="text1"/>
+                                <w:kern w:val="24"/>
+                                <w:sz w:val="20"/>
+                                <w:szCs w:val="20"/>
+                                <w14:ligatures w14:val="none"/>
+                              </w:rPr>
+                            </w:pPr>
+                            <w:r>
+                              <w:rPr>
+                                <w:rFonts w:hAnsi="Calibri"/>
+                                <w:color w:val="000000" w:themeColor="text1"/>
+                                <w:kern w:val="24"/>
+                                <w:sz w:val="20"/>
+                                <w:szCs w:val="20"/>
+                              </w:rPr>
+                              <w:t>On identifie zone intérêt</w:t>
+                            </w:r>
+                          </w:p>
+                        </w:txbxContent>
+                      </wps:txbx>
+                      <wps:bodyPr wrap="square" rtlCol="0">
+                        <a:spAutoFit/>
+                      </wps:bodyPr>
+                    </wps:wsp>
+                  </a:graphicData>
+                </a:graphic>
+              </wp:anchor>
+            </w:drawing>
+          </mc:Choice>
+          <mc:Fallback>
+            <w:pict>
+              <v:shape w14:anchorId="50401751" id="ZoneTexte 23" o:spid="_x0000_s1041" type="#_x0000_t202" style="position:absolute;margin-left:225pt;margin-top:228pt;width:117pt;height:31.5pt;z-index:251674624;visibility:visible;mso-wrap-style:square;mso-wrap-distance-left:9pt;mso-wrap-distance-top:0;mso-wrap-distance-right:9pt;mso-wrap-distance-bottom:0;mso-position-horizontal:absolute;mso-position-horizontal-relative:text;mso-position-vertical:absolute;mso-position-vertical-relative:text;v-text-anchor:top" o:gfxdata="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" filled="f" stroked="f">
+                <v:textbox style="mso-fit-shape-to-text:t">
+                  <w:txbxContent>
+                    <w:p>
+                      <w:pPr>
+                        <w:jc w:val="center"/>
+                        <w:rPr>
+                          <w:rFonts w:hAnsi="Calibri"/>
+                          <w:color w:val="000000" w:themeColor="text1"/>
+                          <w:kern w:val="24"/>
+                          <w:sz w:val="20"/>
+                          <w:szCs w:val="20"/>
+                          <w14:ligatures w14:val="none"/>
+                        </w:rPr>
+                      </w:pPr>
+                      <w:r>
+                        <w:rPr>
+                          <w:rFonts w:hAnsi="Calibri"/>
+                          <w:color w:val="000000" w:themeColor="text1"/>
+                          <w:kern w:val="24"/>
+                          <w:sz w:val="20"/>
+                          <w:szCs w:val="20"/>
+                        </w:rPr>
+                        <w:t>On identifie zone intérêt</w:t>
+                      </w:r>
+                    </w:p>
+                  </w:txbxContent>
+                </v:textbox>
+              </v:shape>
+            </w:pict>
+          </mc:Fallback>
+        </mc:AlternateContent>
+      </w:r>
+      <w:r>
+        <w:drawing>
+          <wp:anchor distT="0" distB="0" distL="114300" distR="114300" simplePos="0" relativeHeight="251675648" behindDoc="0" locked="0" layoutInCell="1" allowOverlap="1" wp14:anchorId="2539B80D" wp14:editId="0DB94E9C">
+            <wp:simplePos x="0" y="0"/>
+            <wp:positionH relativeFrom="column">
+              <wp:posOffset>5257800</wp:posOffset>
+            </wp:positionH>
+            <wp:positionV relativeFrom="paragraph">
+              <wp:posOffset>1924050</wp:posOffset>
+            </wp:positionV>
+            <wp:extent cx="1485900" cy="844504"/>
+            <wp:effectExtent l="0" t="0" r="0" b="0"/>
+            <wp:wrapNone/>
+            <wp:docPr id="25" name="Image 24" descr="Une image contenant capture d’écran, obscurité, noir&#10;&#10;Le contenu généré par l’IA peut être incorrect.">
+              <a:extLst xmlns:a="http://schemas.openxmlformats.org/drawingml/2006/main">
+                <a:ext uri="{FF2B5EF4-FFF2-40B4-BE49-F238E27FC236}">
+                  <a16:creationId xmlns:a16="http://schemas.microsoft.com/office/drawing/2014/main" id="{FB0E5A43-9A9A-AB9B-BE28-0C7386952BC7}"/>
+                </a:ext>
+              </a:extLst>
+            </wp:docPr>
+            <wp:cNvGraphicFramePr>
+              <a:graphicFrameLocks xmlns:a="http://schemas.openxmlformats.org/drawingml/2006/main" noChangeAspect="1"/>
+            </wp:cNvGraphicFramePr>
+            <a:graphic xmlns:a="http://schemas.openxmlformats.org/drawingml/2006/main">
+              <a:graphicData uri="http://schemas.openxmlformats.org/drawingml/2006/picture">
+                <pic:pic xmlns:pic="http://schemas.openxmlformats.org/drawingml/2006/picture">
+                  <pic:nvPicPr>
+                    <pic:cNvPr id="25" name="Image 24" descr="Une image contenant capture d’écran, obscurité, noir&#10;&#10;Le contenu généré par l’IA peut être incorrect.">
+                      <a:extLst>
+                        <a:ext uri="{FF2B5EF4-FFF2-40B4-BE49-F238E27FC236}">
+                          <a16:creationId xmlns:a16="http://schemas.microsoft.com/office/drawing/2014/main" id="{FB0E5A43-9A9A-AB9B-BE28-0C7386952BC7}"/>
+                        </a:ext>
+                      </a:extLst>
+                    </pic:cNvPr>
+                    <pic:cNvPicPr>
+                      <a:picLocks noChangeAspect="1"/>
+                    </pic:cNvPicPr>
+                  </pic:nvPicPr>
+                  <pic:blipFill>
+                    <a:blip r:embed="rId11"/>
+                    <a:stretch>
+                      <a:fillRect/>
+                    </a:stretch>
+                  </pic:blipFill>
+                  <pic:spPr>
+                    <a:xfrm>
+                      <a:off x="0" y="0"/>
+                      <a:ext cx="1485900" cy="844504"/>
+                    </a:xfrm>
+                    <a:prstGeom prst="rect">
+                      <a:avLst/>
+                    </a:prstGeom>
+                  </pic:spPr>
+                </pic:pic>
+              </a:graphicData>
+            </a:graphic>
+          </wp:anchor>
+        </w:drawing>
+      </w:r>
+      <w:r>
+        <mc:AlternateContent>
+          <mc:Choice Requires="wps">
+            <w:drawing>
+              <wp:anchor distT="0" distB="0" distL="114300" distR="114300" simplePos="0" relativeHeight="251676672" behindDoc="0" locked="0" layoutInCell="1" allowOverlap="1" wp14:anchorId="3B84B894" wp14:editId="6DA9DEDA">
+                <wp:simplePos x="0" y="0"/>
+                <wp:positionH relativeFrom="column">
+                  <wp:posOffset>5257800</wp:posOffset>
+                </wp:positionH>
+                <wp:positionV relativeFrom="paragraph">
+                  <wp:posOffset>2876550</wp:posOffset>
+                </wp:positionV>
+                <wp:extent cx="1485900" cy="400110"/>
+                <wp:effectExtent l="0" t="0" r="0" b="0"/>
+                <wp:wrapNone/>
+                <wp:docPr id="26" name="ZoneTexte 25">
+                  <a:extLst xmlns:a="http://schemas.openxmlformats.org/drawingml/2006/main">
+                    <a:ext uri="{FF2B5EF4-FFF2-40B4-BE49-F238E27FC236}">
+                      <a16:creationId xmlns:a16="http://schemas.microsoft.com/office/drawing/2014/main" id="{B3A9EA7F-A1BB-1D94-0E65-2167A4B0C6C3}"/>
+                    </a:ext>
+                  </a:extLst>
+                </wp:docPr>
+                <wp:cNvGraphicFramePr/>
+                <a:graphic xmlns:a="http://schemas.openxmlformats.org/drawingml/2006/main">
+                  <a:graphicData uri="http://schemas.microsoft.com/office/word/2010/wordprocessingShape">
+                    <wps:wsp>
+                      <wps:cNvSpPr txBox="1"/>
+                      <wps:spPr>
+                        <a:xfrm>
+                          <a:off x="0" y="0"/>
+                          <a:ext cx="1485900" cy="400110"/>
+                        </a:xfrm>
+                        <a:prstGeom prst="rect">
+                          <a:avLst/>
+                        </a:prstGeom>
+                        <a:noFill/>
+                      </wps:spPr>
+                      <wps:txbx>
+                        <w:txbxContent>
+                          <w:p>
+                            <w:pPr>
+                              <w:jc w:val="center"/>
+                              <w:rPr>
+                                <w:rFonts w:hAnsi="Calibri"/>
+                                <w:color w:val="000000" w:themeColor="text1"/>
+                                <w:kern w:val="24"/>
+                                <w:sz w:val="20"/>
+                                <w:szCs w:val="20"/>
+                                <w14:ligatures w14:val="none"/>
+                              </w:rPr>
+                            </w:pPr>
+                            <w:r>
+                              <w:rPr>
+                                <w:rFonts w:hAnsi="Calibri"/>
+                                <w:color w:val="000000" w:themeColor="text1"/>
+                                <w:kern w:val="24"/>
+                                <w:sz w:val="20"/>
+                                <w:szCs w:val="20"/>
+                              </w:rPr>
+                              <w:t>On passe en gris puis en binaire noir et blanc</w:t>
+                            </w:r>
+                          </w:p>
+                        </w:txbxContent>
+                      </wps:txbx>
+                      <wps:bodyPr wrap="square" rtlCol="0">
+                        <a:spAutoFit/>
+                      </wps:bodyPr>
+                    </wps:wsp>
+                  </a:graphicData>
+                </a:graphic>
+              </wp:anchor>
+            </w:drawing>
+          </mc:Choice>
+          <mc:Fallback>
+            <w:pict>
+              <v:shape w14:anchorId="3B84B894" id="ZoneTexte 25" o:spid="_x0000_s1042" type="#_x0000_t202" style="position:absolute;margin-left:414pt;margin-top:226.5pt;width:117pt;height:31.5pt;z-index:251676672;visibility:visible;mso-wrap-style:square;mso-wrap-distance-left:9pt;mso-wrap-distance-top:0;mso-wrap-distance-right:9pt;mso-wrap-distance-bottom:0;mso-position-horizontal:absolute;mso-position-horizontal-relative:text;mso-position-vertical:absolute;mso-position-vertical-relative:text;v-text-anchor:top" o:gfxdata="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" filled="f" stroked="f">
+                <v:textbox style="mso-fit-shape-to-text:t">
+                  <w:txbxContent>
+                    <w:p>
+                      <w:pPr>
+                        <w:jc w:val="center"/>
+                        <w:rPr>
+                          <w:rFonts w:hAnsi="Calibri"/>
+                          <w:color w:val="000000" w:themeColor="text1"/>
+                          <w:kern w:val="24"/>
+                          <w:sz w:val="20"/>
+                          <w:szCs w:val="20"/>
+                          <w14:ligatures w14:val="none"/>
+                        </w:rPr>
+                      </w:pPr>
+                      <w:r>
+                        <w:rPr>
+                          <w:rFonts w:hAnsi="Calibri"/>
+                          <w:color w:val="000000" w:themeColor="text1"/>
+                          <w:kern w:val="24"/>
+                          <w:sz w:val="20"/>
+                          <w:szCs w:val="20"/>
+                        </w:rPr>
+                        <w:t>On passe en gris puis en binaire noir et blanc</w:t>
+                      </w:r>
+                    </w:p>
+                  </w:txbxContent>
+                </v:textbox>
+              </v:shape>
+            </w:pict>
+          </mc:Fallback>
+        </mc:AlternateContent>
+      </w:r>
+      <w:r>
+        <mc:AlternateContent>
+          <mc:Choice Requires="wps">
+            <w:drawing>
+              <wp:anchor distT="0" distB="0" distL="114300" distR="114300" simplePos="0" relativeHeight="251677696" behindDoc="0" locked="0" layoutInCell="1" allowOverlap="1" wp14:anchorId="28D75047" wp14:editId="672F69AA">
+                <wp:simplePos x="0" y="0"/>
+                <wp:positionH relativeFrom="column">
+                  <wp:posOffset>4572000</wp:posOffset>
+                </wp:positionH>
+                <wp:positionV relativeFrom="paragraph">
+                  <wp:posOffset>2533650</wp:posOffset>
+                </wp:positionV>
+                <wp:extent cx="508000" cy="0"/>
+                <wp:effectExtent l="0" t="76200" r="25400" b="95250"/>
+                <wp:wrapNone/>
+                <wp:docPr id="27" name="Connecteur droit avec flèche 26">
+                  <a:extLst xmlns:a="http://schemas.openxmlformats.org/drawingml/2006/main">
+                    <a:ext uri="{FF2B5EF4-FFF2-40B4-BE49-F238E27FC236}">
+                      <a16:creationId xmlns:a16="http://schemas.microsoft.com/office/drawing/2014/main" id="{F816E4FD-2491-C149-7CA9-DED1ABA99A9E}"/>
+                    </a:ext>
+                  </a:extLst>
+                </wp:docPr>
+                <wp:cNvGraphicFramePr/>
+                <a:graphic xmlns:a="http://schemas.openxmlformats.org/drawingml/2006/main">
+                  <a:graphicData uri="http://schemas.microsoft.com/office/word/2010/wordprocessingShape">
+                    <wps:wsp>
+                      <wps:cNvCnPr/>
+                      <wps:spPr>
+                        <a:xfrm>
+                          <a:off x="0" y="0"/>
+                          <a:ext cx="508000" cy="0"/>
+                        </a:xfrm>
+                        <a:prstGeom prst="straightConnector1">
+                          <a:avLst/>
+                        </a:prstGeom>
+                        <a:ln>
+                          <a:solidFill>
+                            <a:schemeClr val="tx1"/>
+                          </a:solidFill>
+                          <a:tailEnd type="triangle"/>
+                        </a:ln>
+                      </wps:spPr>
+                      <wps:style>
+                        <a:lnRef idx="2">
+                          <a:schemeClr val="accent1"/>
+                        </a:lnRef>
+                        <a:fillRef idx="0">
+                          <a:schemeClr val="accent1"/>
+                        </a:fillRef>
+                        <a:effectRef idx="1">
+                          <a:schemeClr val="accent1"/>
+                        </a:effectRef>
+                        <a:fontRef idx="minor">
+                          <a:schemeClr val="tx1"/>
+                        </a:fontRef>
+                      </wps:style>
+                      <wps:bodyPr/>
+                    </wps:wsp>
+                  </a:graphicData>
+                </a:graphic>
+              </wp:anchor>
+            </w:drawing>
+          </mc:Choice>
+          <mc:Fallback>
+            <w:pict>
+              <v:shape w14:anchorId="179D78AE" id="Connecteur droit avec flèche 26" o:spid="_x0000_s1026" type="#_x0000_t32" style="position:absolute;margin-left:5in;margin-top:199.5pt;width:40pt;height:0;z-index:251677696;visibility:visible;mso-wrap-style:square;mso-wrap-distance-left:9pt;mso-wrap-distance-top:0;mso-wrap-distance-right:9pt;mso-wrap-distance-bottom:0;mso-position-horizontal:absolute;mso-position-horizontal-relative:text;mso-position-vertical:absolute;mso-position-vertical-relative:text" o:gfxdata="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" strokecolor="black [3213]" strokeweight="1pt">
+                <v:stroke endarrow="block" joinstyle="miter"/>
+              </v:shape>
+            </w:pict>
+          </mc:Fallback>
+        </mc:AlternateContent>
+      </w:r>
+      <w:r>
+        <w:drawing>
+          <wp:anchor distT="0" distB="0" distL="114300" distR="114300" simplePos="0" relativeHeight="251678720" behindDoc="0" locked="0" layoutInCell="1" allowOverlap="1" wp14:anchorId="20F58F9A" wp14:editId="19097012">
+            <wp:simplePos x="0" y="0"/>
+            <wp:positionH relativeFrom="column">
+              <wp:posOffset>7658100</wp:posOffset>
+            </wp:positionH>
+            <wp:positionV relativeFrom="paragraph">
+              <wp:posOffset>1924050</wp:posOffset>
+            </wp:positionV>
+            <wp:extent cx="1485900" cy="844504"/>
+            <wp:effectExtent l="0" t="0" r="0" b="0"/>
+            <wp:wrapNone/>
+            <wp:docPr id="28" name="Image 27" descr="Une image contenant capture d’écran, obscurité, noir&#10;&#10;Le contenu généré par l’IA peut être incorrect.">
+              <a:extLst xmlns:a="http://schemas.openxmlformats.org/drawingml/2006/main">
+                <a:ext uri="{FF2B5EF4-FFF2-40B4-BE49-F238E27FC236}">
+                  <a16:creationId xmlns:a16="http://schemas.microsoft.com/office/drawing/2014/main" id="{F4DF650D-EEAD-1489-0210-C38C3690F686}"/>
+                </a:ext>
+              </a:extLst>
+            </wp:docPr>
+            <wp:cNvGraphicFramePr>
+              <a:graphicFrameLocks xmlns:a="http://schemas.openxmlformats.org/drawingml/2006/main" noChangeAspect="1"/>
+            </wp:cNvGraphicFramePr>
+            <a:graphic xmlns:a="http://schemas.openxmlformats.org/drawingml/2006/main">
+              <a:graphicData uri="http://schemas.openxmlformats.org/drawingml/2006/picture">
+                <pic:pic xmlns:pic="http://schemas.openxmlformats.org/drawingml/2006/picture">
+                  <pic:nvPicPr>
+                    <pic:cNvPr id="28" name="Image 27" descr="Une image contenant capture d’écran, obscurité, noir&#10;&#10;Le contenu généré par l’IA peut être incorrect.">
+                      <a:extLst>
+                        <a:ext uri="{FF2B5EF4-FFF2-40B4-BE49-F238E27FC236}">
+                          <a16:creationId xmlns:a16="http://schemas.microsoft.com/office/drawing/2014/main" id="{F4DF650D-EEAD-1489-0210-C38C3690F686}"/>
+                        </a:ext>
+                      </a:extLst>
+                    </pic:cNvPr>
+                    <pic:cNvPicPr>
+                      <a:picLocks noChangeAspect="1"/>
+                    </pic:cNvPicPr>
+                  </pic:nvPicPr>
+                  <pic:blipFill>
+                    <a:blip r:embed="rId11"/>
+                    <a:stretch>
+                      <a:fillRect/>
+                    </a:stretch>
+                  </pic:blipFill>
+                  <pic:spPr>
+                    <a:xfrm>
+                      <a:off x="0" y="0"/>
+                      <a:ext cx="1485900" cy="844504"/>
+                    </a:xfrm>
+                    <a:prstGeom prst="rect">
+                      <a:avLst/>
+                    </a:prstGeom>
+                  </pic:spPr>
+                </pic:pic>
+              </a:graphicData>
+            </a:graphic>
+          </wp:anchor>
+        </w:drawing>
+      </w:r>
+      <w:r>
+        <mc:AlternateContent>
+          <mc:Choice Requires="wps">
+            <w:drawing>
+              <wp:anchor distT="0" distB="0" distL="114300" distR="114300" simplePos="0" relativeHeight="251679744" behindDoc="0" locked="0" layoutInCell="1" allowOverlap="1" wp14:anchorId="26312E70" wp14:editId="47CF4CD6">
+                <wp:simplePos x="0" y="0"/>
+                <wp:positionH relativeFrom="column">
+                  <wp:posOffset>7658100</wp:posOffset>
+                </wp:positionH>
+                <wp:positionV relativeFrom="paragraph">
+                  <wp:posOffset>2876550</wp:posOffset>
+                </wp:positionV>
+                <wp:extent cx="1485900" cy="246221"/>
+                <wp:effectExtent l="0" t="0" r="0" b="0"/>
+                <wp:wrapNone/>
+                <wp:docPr id="29" name="ZoneTexte 28">
+                  <a:extLst xmlns:a="http://schemas.openxmlformats.org/drawingml/2006/main">
+                    <a:ext uri="{FF2B5EF4-FFF2-40B4-BE49-F238E27FC236}">
+                      <a16:creationId xmlns:a16="http://schemas.microsoft.com/office/drawing/2014/main" id="{1E09290A-2FBB-E977-4F69-82D4EB825494}"/>
+                    </a:ext>
+                  </a:extLst>
+                </wp:docPr>
+                <wp:cNvGraphicFramePr/>
+                <a:graphic xmlns:a="http://schemas.openxmlformats.org/drawingml/2006/main">
+                  <a:graphicData uri="http://schemas.microsoft.com/office/word/2010/wordprocessingShape">
+                    <wps:wsp>
+                      <wps:cNvSpPr txBox="1"/>
+                      <wps:spPr>
+                        <a:xfrm>
+                          <a:off x="0" y="0"/>
+                          <a:ext cx="1485900" cy="246221"/>
+                        </a:xfrm>
+                        <a:prstGeom prst="rect">
+                          <a:avLst/>
+                        </a:prstGeom>
+                        <a:noFill/>
+                      </wps:spPr>
+                      <wps:txbx>
+                        <w:txbxContent>
+                          <w:p>
+                            <w:pPr>
+                              <w:jc w:val="center"/>
+                              <w:rPr>
+                                <w:rFonts w:hAnsi="Calibri"/>
+                                <w:color w:val="000000" w:themeColor="text1"/>
+                                <w:kern w:val="24"/>
+                                <w:sz w:val="20"/>
+                                <w:szCs w:val="20"/>
+                                <w14:ligatures w14:val="none"/>
+                              </w:rPr>
+                            </w:pPr>
+                            <w:r>
+                              <w:rPr>
+                                <w:rFonts w:hAnsi="Calibri"/>
+                                <w:color w:val="000000" w:themeColor="text1"/>
+                                <w:kern w:val="24"/>
+                                <w:sz w:val="20"/>
+                                <w:szCs w:val="20"/>
+                              </w:rPr>
+                              <w:t>On identifie rectangle</w:t>
+                            </w:r>
+                          </w:p>
+                        </w:txbxContent>
+                      </wps:txbx>
+                      <wps:bodyPr wrap="square" rtlCol="0">
+                        <a:spAutoFit/>
+                      </wps:bodyPr>
+                    </wps:wsp>
+                  </a:graphicData>
+                </a:graphic>
+              </wp:anchor>
+            </w:drawing>
+          </mc:Choice>
+          <mc:Fallback>
+            <w:pict>
+              <v:shape w14:anchorId="26312E70" id="ZoneTexte 28" o:spid="_x0000_s1043" type="#_x0000_t202" style="position:absolute;margin-left:603pt;margin-top:226.5pt;width:117pt;height:19.4pt;z-index:251679744;visibility:visible;mso-wrap-style:square;mso-wrap-distance-left:9pt;mso-wrap-distance-top:0;mso-wrap-distance-right:9pt;mso-wrap-distance-bottom:0;mso-position-horizontal:absolute;mso-position-horizontal-relative:text;mso-position-vertical:absolute;mso-position-vertical-relative:text;v-text-anchor:top" o:gfxdata="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" filled="f" stroked="f">
+                <v:textbox style="mso-fit-shape-to-text:t">
+                  <w:txbxContent>
+                    <w:p>
+                      <w:pPr>
+                        <w:jc w:val="center"/>
+                        <w:rPr>
+                          <w:rFonts w:hAnsi="Calibri"/>
+                          <w:color w:val="000000" w:themeColor="text1"/>
+                          <w:kern w:val="24"/>
+                          <w:sz w:val="20"/>
+                          <w:szCs w:val="20"/>
+                          <w14:ligatures w14:val="none"/>
+                        </w:rPr>
+                      </w:pPr>
+                      <w:r>
+                        <w:rPr>
+                          <w:rFonts w:hAnsi="Calibri"/>
+                          <w:color w:val="000000" w:themeColor="text1"/>
+                          <w:kern w:val="24"/>
+                          <w:sz w:val="20"/>
+                          <w:szCs w:val="20"/>
+                        </w:rPr>
+                        <w:t>On identifie rectangle</w:t>
+                      </w:r>
+                    </w:p>
+                  </w:txbxContent>
+                </v:textbox>
+              </v:shape>
+            </w:pict>
+          </mc:Fallback>
+        </mc:AlternateContent>
+      </w:r>
+      <w:r>
+        <mc:AlternateContent>
+          <mc:Choice Requires="wps">
+            <w:drawing>
+              <wp:anchor distT="0" distB="0" distL="114300" distR="114300" simplePos="0" relativeHeight="251680768" behindDoc="0" locked="0" layoutInCell="1" allowOverlap="1" wp14:anchorId="76C398E3" wp14:editId="48CD32ED">
+                <wp:simplePos x="0" y="0"/>
+                <wp:positionH relativeFrom="column">
+                  <wp:posOffset>6972300</wp:posOffset>
+                </wp:positionH>
+                <wp:positionV relativeFrom="paragraph">
+                  <wp:posOffset>2533650</wp:posOffset>
+                </wp:positionV>
+                <wp:extent cx="508000" cy="0"/>
+                <wp:effectExtent l="0" t="76200" r="25400" b="95250"/>
+                <wp:wrapNone/>
+                <wp:docPr id="30" name="Connecteur droit avec flèche 29">
+                  <a:extLst xmlns:a="http://schemas.openxmlformats.org/drawingml/2006/main">
+                    <a:ext uri="{FF2B5EF4-FFF2-40B4-BE49-F238E27FC236}">
+                      <a16:creationId xmlns:a16="http://schemas.microsoft.com/office/drawing/2014/main" id="{654AD14B-9241-8837-A5C3-79847B60EB80}"/>
+                    </a:ext>
+                  </a:extLst>
+                </wp:docPr>
+                <wp:cNvGraphicFramePr/>
+                <a:graphic xmlns:a="http://schemas.openxmlformats.org/drawingml/2006/main">
+                  <a:graphicData uri="http://schemas.microsoft.com/office/word/2010/wordprocessingShape">
+                    <wps:wsp>
+                      <wps:cNvCnPr/>
+                      <wps:spPr>
+                        <a:xfrm>
+                          <a:off x="0" y="0"/>
+                          <a:ext cx="508000" cy="0"/>
+                        </a:xfrm>
+                        <a:prstGeom prst="straightConnector1">
+                          <a:avLst/>
+                        </a:prstGeom>
+                        <a:ln>
+                          <a:solidFill>
+                            <a:schemeClr val="tx1"/>
+                          </a:solidFill>
+                          <a:tailEnd type="triangle"/>
+                        </a:ln>
+                      </wps:spPr>
+                      <wps:style>
+                        <a:lnRef idx="2">
+                          <a:schemeClr val="accent1"/>
+                        </a:lnRef>
+                        <a:fillRef idx="0">
+                          <a:schemeClr val="accent1"/>
+                        </a:fillRef>
+                        <a:effectRef idx="1">
+                          <a:schemeClr val="accent1"/>
+                        </a:effectRef>
+                        <a:fontRef idx="minor">
+                          <a:schemeClr val="tx1"/>
+                        </a:fontRef>
+                      </wps:style>
+                      <wps:bodyPr/>
+                    </wps:wsp>
+                  </a:graphicData>
+                </a:graphic>
+              </wp:anchor>
+            </w:drawing>
+          </mc:Choice>
+          <mc:Fallback>
+            <w:pict>
+              <v:shape w14:anchorId="2729DDE5" id="Connecteur droit avec flèche 29" o:spid="_x0000_s1026" type="#_x0000_t32" style="position:absolute;margin-left:549pt;margin-top:199.5pt;width:40pt;height:0;z-index:251680768;visibility:visible;mso-wrap-style:square;mso-wrap-distance-left:9pt;mso-wrap-distance-top:0;mso-wrap-distance-right:9pt;mso-wrap-distance-bottom:0;mso-position-horizontal:absolute;mso-position-horizontal-relative:text;mso-position-vertical:absolute;mso-position-vertical-relative:text" o:gfxdata="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" strokecolor="black [3213]" strokeweight="1pt">
+                <v:stroke endarrow="block" joinstyle="miter"/>
+              </v:shape>
+            </w:pict>
+          </mc:Fallback>
+        </mc:AlternateContent>
       </w:r>
     </w:p>
     <w:sectPr>
@@ -1376,7 +5507,6 @@
   <w:style w:type="character" w:default="1" w:styleId="Policepardfaut">
     <w:name w:val="Default Paragraph Font"/>
     <w:uiPriority w:val="1"/>
-    <w:semiHidden/>
     <w:unhideWhenUsed/>
   </w:style>
   <w:style w:type="table" w:default="1" w:styleId="TableauNormal">

</xml_diff>